<commit_message>
Wrap long commands in the app, and recapture the interface figure
The dtifit command ran off the right edge of the code block, where a
horizontal scrollbar hid it, so Supplementary Figure S1 showed it cut off
mid-argument. Code blocks now wrap, and the figure is recaptured from the
wrapped layout on the Stanford dataset.

This release also carries the language pass and the figure corrections:
"bias" now names only deviation from truth, while the between-arm mean
difference is called a difference; the longest sentences are split and the
Results read in past tense; figure panels name the command each ran,
scatter axes start at the mask threshold, and the Bland-Altman panel
scales to the bulk of the differences and states how many voxels fall
outside. Both explanation documents are rewritten for the current results.

Co-Authored-By: Claude Opus 5 <noreply@anthropic.com>
Claude-Session: https://claude.ai/code/session_01Wud2CkZ5pwEHAeXS56jgLS
</commit_message>
<xml_diff>
--- a/docs/PAPER_EXPLAINED.docx
+++ b/docs/PAPER_EXPLAINED.docx
@@ -23,7 +23,7 @@
           <w:color w:val="333333"/>
           <w:sz w:val="21"/>
         </w:rPr>
-        <w:t>Everything needed to explain and defend this paper: what it claims, why each choice was made, what every figure and table shows, how the argument was corrected twice along the way, and the questions an expert will ask.</w:t>
+        <w:t>Everything needed to explain and defend this paper: what it claims, why each choice was made, what every table and figure shows, how the argument was corrected four times, and the questions an expert will ask.</w:t>
       </w:r>
     </w:p>
     <w:tbl>
@@ -60,7 +60,7 @@
                 <w:color w:val="1B4D3E"/>
                 <w:sz w:val="21"/>
               </w:rPr>
-              <w:t>Bu makaleyi anlatmak ve savunmak için gereken her şey: ne iddia ediyor, her tercih neden yapıldı, her figür ve tablo neyi gösteriyor, argüman yol boyunca nasıl iki kez düzeltildi, ve bir uzmanın soracağı sorular.</w:t>
+              <w:t>Bu makaleyi anlatmak ve savunmak için gereken her şey: ne iddia ediyor, her tercih neden yapıldı, her tablo ve figür neyi gösteriyor, argüman dört kez nasıl düzeltildi, ve bir uzmanın soracağı sorular.</w:t>
             </w:r>
           </w:p>
         </w:tc>
@@ -87,7 +87,7 @@
           <w:color w:val="333333"/>
           <w:sz w:val="21"/>
         </w:rPr>
-        <w:t>Diffusion MRI is analysed with three packages: FSL, MRtrix3, DIPY. When their outputs differ, the field calls this "software-related variability" and moves on.</w:t>
+        <w:t>Diffusion MRI is analysed with three packages: FSL, MRtrix3 and DIPY. When their outputs differ, the field calls this "software-related variability" and moves on.</w:t>
       </w:r>
     </w:p>
     <w:p>
@@ -118,7 +118,7 @@
           <w:color w:val="333333"/>
           <w:sz w:val="21"/>
         </w:rPr>
-        <w:t xml:space="preserve"> You have a signal measured in many directions, and you fit an ellipsoid to it. Because noise is not equal across measurements, the fit should be </w:t>
+        <w:t xml:space="preserve"> A signal is measured in many directions and an ellipsoid is fitted to it. Because the logarithm distorts the noise, the fit should be </w:t>
       </w:r>
       <w:r>
         <w:rPr>
@@ -136,18 +136,7 @@
           <w:color w:val="333333"/>
           <w:sz w:val="21"/>
         </w:rPr>
-        <w:t xml:space="preserve"> — some measurements count more than others. The question is: where do the weights come from?</w:t>
-      </w:r>
-    </w:p>
-    <w:p>
-      <w:r>
-        <w:rPr>
-          <w:rFonts w:ascii="Calibri" w:hAnsi="Calibri"/>
-          <w:b w:val="0"/>
-          <w:color w:val="333333"/>
-          <w:sz w:val="21"/>
-        </w:rPr>
-        <w:t>There are two answers in use:</w:t>
+        <w:t>. The question is where the weights come from, and there are two answers in use:</w:t>
       </w:r>
     </w:p>
     <w:tbl>
@@ -428,7 +417,7 @@
           <w:color w:val="333333"/>
           <w:sz w:val="21"/>
         </w:rPr>
-        <w:t>Veraart et al. (2013) already established that the second is more accurate.</w:t>
+        <w:t>Veraart et al. (2013) already established that the second is more accurate in MD.</w:t>
       </w:r>
       <w:r>
         <w:rPr>
@@ -448,7 +437,7 @@
           <w:color w:val="333333"/>
           <w:sz w:val="21"/>
         </w:rPr>
-        <w:t>Our three findings:</w:t>
+        <w:t>Three findings:</w:t>
       </w:r>
     </w:p>
     <w:p>
@@ -498,7 +487,7 @@
           <w:color w:val="333333"/>
           <w:sz w:val="21"/>
         </w:rPr>
-        <w:t xml:space="preserve"> tensors — r = 1.0000, mean absolute error 0.0000. Two independent codebases, same answer. 2. </w:t>
+        <w:t xml:space="preserve"> tensors: r = 1.0000, mean absolute error below 0.0001. Two independent codebases, same answer. 2. </w:t>
       </w:r>
       <w:r>
         <w:rPr>
@@ -542,7 +531,7 @@
           <w:color w:val="333333"/>
           <w:sz w:val="21"/>
         </w:rPr>
-        <w:t>It matters at realistic noise.</w:t>
+        <w:t>It costs something real.</w:t>
       </w:r>
       <w:r>
         <w:rPr>
@@ -551,27 +540,7 @@
           <w:color w:val="333333"/>
           <w:sz w:val="21"/>
         </w:rPr>
-        <w:t xml:space="preserve"> At SNR 30 the two schemes are equivalent. At SNR 10 the measured-signal scheme carries roughly twice the mean diffusivity bias. Real data at high b-values lives closer to SNR 10.</w:t>
-      </w:r>
-    </w:p>
-    <w:p>
-      <w:r>
-        <w:rPr>
-          <w:rFonts w:ascii="Calibri" w:hAnsi="Calibri"/>
-          <w:b/>
-          <w:color w:val="333333"/>
-          <w:sz w:val="21"/>
-        </w:rPr>
-        <w:t>Bottom line:</w:t>
-      </w:r>
-      <w:r>
-        <w:rPr>
-          <w:rFonts w:ascii="Calibri" w:hAnsi="Calibri"/>
-          <w:b w:val="0"/>
-          <w:color w:val="333333"/>
-          <w:sz w:val="21"/>
-        </w:rPr>
-        <w:t xml:space="preserve"> changing one flag inside FSL moves FA more than replacing FSL with a different toolkit entirely.</w:t>
+        <w:t xml:space="preserve"> In the phantom, measured-signal weighting underestimates MD by 0.054 µm²/ms at SNR 10, while the other linear fits stay within 0.007 of truth. On simulations of both real protocols its MD bias is the largest in every condition. On real data, one flag inside FSL changes FA more than replacing FSL with another toolkit at a matched estimator.</w:t>
       </w:r>
     </w:p>
     <w:tbl>
@@ -608,7 +577,7 @@
                 <w:color w:val="1B4D3E"/>
                 <w:sz w:val="21"/>
               </w:rPr>
-              <w:t>Difüzyon MRI üç paketle analiz ediliyor: FSL, MRtrix3, DIPY. Çıktıları farklılaştığında alan buna "yazılım kaynaklı değişkenlik" deyip geçiyor.</w:t>
+              <w:t>Difüzyon MRI üç paketle analiz ediliyor: FSL, MRtrix3 ve DIPY. Çıktıları farklılaştığında alan buna "yazılım kaynaklı değişkenlik" deyip geçiyor.</w:t>
             </w:r>
           </w:p>
         </w:tc>
@@ -697,7 +666,7 @@
                 <w:color w:val="1B4D3E"/>
                 <w:sz w:val="21"/>
               </w:rPr>
-              <w:t xml:space="preserve"> Çok sayıda yönde ölçülmüş bir sinyalin var, ona bir elipsoit uyduruyorsun. Gürültü ölçümler arasında eşit olmadığı için uydurma </w:t>
+              <w:t xml:space="preserve"> Çok sayıda yönde ölçülmüş bir sinyale elipsoit uyduruluyor. Logaritma gürültüyü bozduğu için uydurma </w:t>
             </w:r>
             <w:r>
               <w:rPr>
@@ -715,7 +684,41 @@
                 <w:color w:val="1B4D3E"/>
                 <w:sz w:val="21"/>
               </w:rPr>
-              <w:t xml:space="preserve"> olmalı — bazı ölçümler daha çok saymalı. Soru şu: ağırlıklar nereden geliyor?</w:t>
+              <w:t xml:space="preserve"> olmalı. Soru şu: ağırlıklar nereden geliyor? Kullanımda iki cevap var: ölçülen sinyal (FSL </w:t>
+            </w:r>
+            <w:r>
+              <w:rPr>
+                <w:rFonts w:ascii="Consolas" w:hAnsi="Consolas"/>
+                <w:color w:val="1B4D3E"/>
+                <w:sz w:val="21"/>
+              </w:rPr>
+              <w:t>--wls</w:t>
+            </w:r>
+            <w:r>
+              <w:rPr>
+                <w:rFonts w:ascii="Calibri" w:hAnsi="Calibri"/>
+                <w:b w:val="0"/>
+                <w:color w:val="1B4D3E"/>
+                <w:sz w:val="21"/>
+              </w:rPr>
+              <w:t xml:space="preserve">, MRtrix3 </w:t>
+            </w:r>
+            <w:r>
+              <w:rPr>
+                <w:rFonts w:ascii="Consolas" w:hAnsi="Consolas"/>
+                <w:color w:val="1B4D3E"/>
+                <w:sz w:val="21"/>
+              </w:rPr>
+              <w:t>-iter 0</w:t>
+            </w:r>
+            <w:r>
+              <w:rPr>
+                <w:rFonts w:ascii="Calibri" w:hAnsi="Calibri"/>
+                <w:b w:val="0"/>
+                <w:color w:val="1B4D3E"/>
+                <w:sz w:val="21"/>
+              </w:rPr>
+              <w:t>) ya da ilk kaba fitten tahmin edilen sinyal (DIPY, MRtrix3 varsayılanı).</w:t>
             </w:r>
           </w:p>
         </w:tc>
@@ -751,263 +754,20 @@
             <w:r>
               <w:rPr>
                 <w:rFonts w:ascii="Calibri" w:hAnsi="Calibri"/>
+                <w:b/>
+                <w:color w:val="1B4D3E"/>
+                <w:sz w:val="21"/>
+              </w:rPr>
+              <w:t>Veraart ve ark. (2013) ikincisinin MD'de daha doğru olduğunu zaten göstermişti.</w:t>
+            </w:r>
+            <w:r>
+              <w:rPr>
+                <w:rFonts w:ascii="Calibri" w:hAnsi="Calibri"/>
                 <w:b w:val="0"/>
                 <w:color w:val="1B4D3E"/>
                 <w:sz w:val="21"/>
               </w:rPr>
-              <w:t>Kullanımda iki cevap var:</w:t>
-            </w:r>
-          </w:p>
-        </w:tc>
-      </w:tr>
-    </w:tbl>
-    <w:tbl>
-      <w:tblPr>
-        <w:tblStyle w:val="TableGrid"/>
-        <w:tblW w:type="auto" w:w="0"/>
-        <w:jc w:val="center"/>
-        <w:tblLook w:firstColumn="1" w:firstRow="1" w:lastColumn="0" w:lastRow="0" w:noHBand="0" w:noVBand="1" w:val="04A0"/>
-        <w:tblBorders>
-          <w:top w:val="single" w:sz="12" w:space="0" w:color="000000"/>
-          <w:bottom w:val="single" w:sz="12" w:space="0" w:color="000000"/>
-          <w:left w:val="none" w:sz="0" w:space="0" w:color="000000"/>
-          <w:right w:val="none" w:sz="0" w:space="0" w:color="000000"/>
-          <w:insideH w:val="none" w:sz="0" w:space="0" w:color="000000"/>
-          <w:insideV w:val="none" w:sz="0" w:space="0" w:color="000000"/>
-        </w:tblBorders>
-        <w:tblCellMar>
-          <w:top w:w="60" w:type="dxa"/>
-          <w:bottom w:w="60" w:type="dxa"/>
-          <w:left w:w="90" w:type="dxa"/>
-          <w:right w:w="90" w:type="dxa"/>
-        </w:tblCellMar>
-      </w:tblPr>
-      <w:tblGrid>
-        <w:gridCol w:w="4929"/>
-        <w:gridCol w:w="4929"/>
-      </w:tblGrid>
-      <w:tr>
-        <w:tc>
-          <w:tcPr>
-            <w:tcW w:type="dxa" w:w="4929"/>
-            <w:shd w:val="clear" w:fill="16213E"/>
-            <w:tcBorders>
-              <w:bottom w:val="single" w:sz="6" w:space="0" w:color="000000"/>
-            </w:tcBorders>
-          </w:tcPr>
-          <w:p>
-            <w:pPr>
-              <w:spacing w:line="240" w:lineRule="auto" w:before="20" w:after="20"/>
-            </w:pPr>
-            <w:r>
-              <w:rPr>
-                <w:rFonts w:ascii="Times New Roman" w:hAnsi="Times New Roman"/>
-                <w:b/>
-                <w:sz w:val="20"/>
-              </w:rPr>
-            </w:r>
-            <w:r>
-              <w:rPr>
-                <w:rFonts w:ascii="Times New Roman" w:hAnsi="Times New Roman"/>
-                <w:b/>
-                <w:color w:val="FFFFFF"/>
-                <w:sz w:val="20"/>
-              </w:rPr>
-              <w:t>Ağırlık kaynağı</w:t>
-            </w:r>
-          </w:p>
-        </w:tc>
-        <w:tc>
-          <w:tcPr>
-            <w:tcW w:type="dxa" w:w="4929"/>
-            <w:shd w:val="clear" w:fill="16213E"/>
-            <w:tcBorders>
-              <w:bottom w:val="single" w:sz="6" w:space="0" w:color="000000"/>
-            </w:tcBorders>
-          </w:tcPr>
-          <w:p>
-            <w:pPr>
-              <w:spacing w:line="240" w:lineRule="auto" w:before="20" w:after="20"/>
-            </w:pPr>
-            <w:r>
-              <w:rPr>
-                <w:rFonts w:ascii="Times New Roman" w:hAnsi="Times New Roman"/>
-                <w:b/>
-                <w:sz w:val="20"/>
-              </w:rPr>
-            </w:r>
-            <w:r>
-              <w:rPr>
-                <w:rFonts w:ascii="Times New Roman" w:hAnsi="Times New Roman"/>
-                <w:b/>
-                <w:color w:val="FFFFFF"/>
-                <w:sz w:val="20"/>
-              </w:rPr>
-              <w:t>Kim kullanıyor</w:t>
-            </w:r>
-          </w:p>
-        </w:tc>
-      </w:tr>
-      <w:tr>
-        <w:tc>
-          <w:tcPr>
-            <w:tcW w:type="dxa" w:w="4929"/>
-          </w:tcPr>
-          <w:p>
-            <w:pPr>
-              <w:spacing w:line="240" w:lineRule="auto" w:before="20" w:after="20"/>
-            </w:pPr>
-            <w:r>
-              <w:rPr>
-                <w:rFonts w:ascii="Times New Roman" w:hAnsi="Times New Roman"/>
-                <w:sz w:val="20"/>
-              </w:rPr>
-            </w:r>
-            <w:r>
-              <w:rPr>
-                <w:rFonts w:ascii="Times New Roman" w:hAnsi="Times New Roman"/>
-                <w:b/>
-                <w:color w:val="333333"/>
-                <w:sz w:val="20"/>
-              </w:rPr>
-              <w:t>Ölçülen</w:t>
-            </w:r>
-            <w:r>
-              <w:rPr>
-                <w:rFonts w:ascii="Times New Roman" w:hAnsi="Times New Roman"/>
-                <w:b w:val="0"/>
-                <w:color w:val="333333"/>
-                <w:sz w:val="20"/>
-              </w:rPr>
-              <w:t xml:space="preserve"> sinyal</w:t>
-            </w:r>
-          </w:p>
-        </w:tc>
-        <w:tc>
-          <w:tcPr>
-            <w:tcW w:type="dxa" w:w="4929"/>
-          </w:tcPr>
-          <w:p>
-            <w:pPr>
-              <w:spacing w:line="240" w:lineRule="auto" w:before="20" w:after="20"/>
-            </w:pPr>
-            <w:r>
-              <w:rPr>
-                <w:rFonts w:ascii="Times New Roman" w:hAnsi="Times New Roman"/>
-                <w:sz w:val="20"/>
-              </w:rPr>
-            </w:r>
-            <w:r>
-              <w:rPr>
-                <w:rFonts w:ascii="Times New Roman" w:hAnsi="Times New Roman"/>
-                <w:b w:val="0"/>
-                <w:color w:val="333333"/>
-                <w:sz w:val="20"/>
-              </w:rPr>
-              <w:t xml:space="preserve">FSL </w:t>
-            </w:r>
-            <w:r>
-              <w:rPr>
-                <w:rFonts w:ascii="Times New Roman" w:hAnsi="Times New Roman"/>
-                <w:color w:val="333333"/>
-                <w:sz w:val="20"/>
-              </w:rPr>
-              <w:t>dtifit --wls</w:t>
-            </w:r>
-            <w:r>
-              <w:rPr>
-                <w:rFonts w:ascii="Times New Roman" w:hAnsi="Times New Roman"/>
-                <w:b w:val="0"/>
-                <w:color w:val="333333"/>
-                <w:sz w:val="20"/>
-              </w:rPr>
-              <w:t xml:space="preserve">, MRtrix3 </w:t>
-            </w:r>
-            <w:r>
-              <w:rPr>
-                <w:rFonts w:ascii="Times New Roman" w:hAnsi="Times New Roman"/>
-                <w:color w:val="333333"/>
-                <w:sz w:val="20"/>
-              </w:rPr>
-              <w:t>dwi2tensor -iter 0</w:t>
-            </w:r>
-          </w:p>
-        </w:tc>
-      </w:tr>
-      <w:tr>
-        <w:tc>
-          <w:tcPr>
-            <w:tcW w:type="dxa" w:w="4929"/>
-          </w:tcPr>
-          <w:p>
-            <w:pPr>
-              <w:spacing w:line="240" w:lineRule="auto" w:before="20" w:after="20"/>
-            </w:pPr>
-            <w:r>
-              <w:rPr>
-                <w:rFonts w:ascii="Times New Roman" w:hAnsi="Times New Roman"/>
-                <w:sz w:val="20"/>
-              </w:rPr>
-            </w:r>
-            <w:r>
-              <w:rPr>
-                <w:rFonts w:ascii="Times New Roman" w:hAnsi="Times New Roman"/>
-                <w:b/>
-                <w:color w:val="333333"/>
-                <w:sz w:val="20"/>
-              </w:rPr>
-              <w:t>Tahmin edilen</w:t>
-            </w:r>
-            <w:r>
-              <w:rPr>
-                <w:rFonts w:ascii="Times New Roman" w:hAnsi="Times New Roman"/>
-                <w:b w:val="0"/>
-                <w:color w:val="333333"/>
-                <w:sz w:val="20"/>
-              </w:rPr>
-              <w:t xml:space="preserve"> sinyal, ilk kaba fitten</w:t>
-            </w:r>
-          </w:p>
-        </w:tc>
-        <w:tc>
-          <w:tcPr>
-            <w:tcW w:type="dxa" w:w="4929"/>
-          </w:tcPr>
-          <w:p>
-            <w:pPr>
-              <w:spacing w:line="240" w:lineRule="auto" w:before="20" w:after="20"/>
-            </w:pPr>
-            <w:r>
-              <w:rPr>
-                <w:rFonts w:ascii="Times New Roman" w:hAnsi="Times New Roman"/>
-                <w:sz w:val="20"/>
-              </w:rPr>
-            </w:r>
-            <w:r>
-              <w:rPr>
-                <w:rFonts w:ascii="Times New Roman" w:hAnsi="Times New Roman"/>
-                <w:b w:val="0"/>
-                <w:color w:val="333333"/>
-                <w:sz w:val="20"/>
-              </w:rPr>
-              <w:t xml:space="preserve">DIPY </w:t>
-            </w:r>
-            <w:r>
-              <w:rPr>
-                <w:rFonts w:ascii="Times New Roman" w:hAnsi="Times New Roman"/>
-                <w:color w:val="333333"/>
-                <w:sz w:val="20"/>
-              </w:rPr>
-              <w:t>WLS</w:t>
-            </w:r>
-            <w:r>
-              <w:rPr>
-                <w:rFonts w:ascii="Times New Roman" w:hAnsi="Times New Roman"/>
-                <w:b w:val="0"/>
-                <w:color w:val="333333"/>
-                <w:sz w:val="20"/>
-              </w:rPr>
-              <w:t>, MRtrix3 varsayılanı</w:t>
+              <w:t xml:space="preserve"> Ölçülen sinyalle ağırlıklandırmak, ağırlıkların tam da bastırmaları gereken gürültüyle kirlenmesi demek.</w:t>
             </w:r>
           </w:p>
         </w:tc>
@@ -1043,20 +803,11 @@
             <w:r>
               <w:rPr>
                 <w:rFonts w:ascii="Calibri" w:hAnsi="Calibri"/>
-                <w:b/>
-                <w:color w:val="1B4D3E"/>
-                <w:sz w:val="21"/>
-              </w:rPr>
-              <w:t>Veraart ve ark. (2013) ikincisinin daha doğru olduğunu zaten göstermişti.</w:t>
-            </w:r>
-            <w:r>
-              <w:rPr>
-                <w:rFonts w:ascii="Calibri" w:hAnsi="Calibri"/>
                 <w:b w:val="0"/>
                 <w:color w:val="1B4D3E"/>
                 <w:sz w:val="21"/>
               </w:rPr>
-              <w:t xml:space="preserve"> Ölçülen sinyalle ağırlıklandırmak, ağırlıkların tam da bastırmaları gereken gürültüyle kirlenmesi demek.</w:t>
+              <w:t>Üç bulgu:</w:t>
             </w:r>
           </w:p>
         </w:tc>
@@ -1096,7 +847,348 @@
                 <w:color w:val="1B4D3E"/>
                 <w:sz w:val="21"/>
               </w:rPr>
-              <w:t>Üç bulgumuz:</w:t>
+              <w:t xml:space="preserve">1. </w:t>
+            </w:r>
+            <w:r>
+              <w:rPr>
+                <w:rFonts w:ascii="Calibri" w:hAnsi="Calibri"/>
+                <w:b/>
+                <w:color w:val="1B4D3E"/>
+                <w:sz w:val="21"/>
+              </w:rPr>
+              <w:t>Değişken uygulama değil.</w:t>
+            </w:r>
+            <w:r>
+              <w:rPr>
+                <w:rFonts w:ascii="Calibri" w:hAnsi="Calibri"/>
+                <w:b w:val="0"/>
+                <w:color w:val="1B4D3E"/>
+                <w:sz w:val="21"/>
+              </w:rPr>
+              <w:t xml:space="preserve"> Aynı estimator verildiğinde FSL ve MRtrix3 </w:t>
+            </w:r>
+            <w:r>
+              <w:rPr>
+                <w:rFonts w:ascii="Calibri" w:hAnsi="Calibri"/>
+                <w:i/>
+                <w:color w:val="1B4D3E"/>
+                <w:sz w:val="21"/>
+              </w:rPr>
+              <w:t>özdeş</w:t>
+            </w:r>
+            <w:r>
+              <w:rPr>
+                <w:rFonts w:ascii="Calibri" w:hAnsi="Calibri"/>
+                <w:b w:val="0"/>
+                <w:color w:val="1B4D3E"/>
+                <w:sz w:val="21"/>
+              </w:rPr>
+              <w:t xml:space="preserve"> tensör üretiyor: r = 1.0000, ortalama mutlak hata 0.0001'in altında. 2. </w:t>
+            </w:r>
+            <w:r>
+              <w:rPr>
+                <w:rFonts w:ascii="Calibri" w:hAnsi="Calibri"/>
+                <w:b/>
+                <w:color w:val="1B4D3E"/>
+                <w:sz w:val="21"/>
+              </w:rPr>
+              <w:t>Değişken varsayılan.</w:t>
+            </w:r>
+            <w:r>
+              <w:rPr>
+                <w:rFonts w:ascii="Calibri" w:hAnsi="Calibri"/>
+                <w:b w:val="0"/>
+                <w:color w:val="1B4D3E"/>
+                <w:sz w:val="21"/>
+              </w:rPr>
+              <w:t xml:space="preserve"> MRtrix3 ve DIPY tavsiye edileni dağıtıyor. FSL sıradan en küçük kareleri, </w:t>
+            </w:r>
+            <w:r>
+              <w:rPr>
+                <w:rFonts w:ascii="Consolas" w:hAnsi="Consolas"/>
+                <w:color w:val="1B4D3E"/>
+                <w:sz w:val="21"/>
+              </w:rPr>
+              <w:t>--wls</w:t>
+            </w:r>
+            <w:r>
+              <w:rPr>
+                <w:rFonts w:ascii="Calibri" w:hAnsi="Calibri"/>
+                <w:b w:val="0"/>
+                <w:color w:val="1B4D3E"/>
+                <w:sz w:val="21"/>
+              </w:rPr>
+              <w:t xml:space="preserve"> seçeneği de Veraart'ın kaçınılmasını söylediği şemayı uyguluyor. Kullanıcı bunu komuttan göremiyor. 3. </w:t>
+            </w:r>
+            <w:r>
+              <w:rPr>
+                <w:rFonts w:ascii="Calibri" w:hAnsi="Calibri"/>
+                <w:b/>
+                <w:color w:val="1B4D3E"/>
+                <w:sz w:val="21"/>
+              </w:rPr>
+              <w:t>Bedeli gerçek.</w:t>
+            </w:r>
+            <w:r>
+              <w:rPr>
+                <w:rFonts w:ascii="Calibri" w:hAnsi="Calibri"/>
+                <w:b w:val="0"/>
+                <w:color w:val="1B4D3E"/>
+                <w:sz w:val="21"/>
+              </w:rPr>
+              <w:t xml:space="preserve"> Fantomda SNR 10'da ölçülen-sinyal ağırlıklandırma MD'yi 0.054 µm²/ms düşük tahmin ediyor; diğer doğrusal fitler gerçeğin 0.007 yakınında kalıyor. İki gerçek protokolün simülasyonunda MD yanlılığı her koşulda en büyük. Gerçek veride ise FSL içinde tek bayrak değiştirmek, FSL'i aynı estimator'le başka bir araçla değiştirmekten daha çok FA kaydırıyor.</w:t>
+            </w:r>
+          </w:p>
+        </w:tc>
+      </w:tr>
+    </w:tbl>
+    <w:p>
+      <w:pPr>
+        <w:spacing w:after="160"/>
+      </w:pPr>
+      <w:r>
+        <w:rPr>
+          <w:b/>
+          <w:color w:val="16213E"/>
+          <w:sz w:val="32"/>
+        </w:rPr>
+        <w:t>PART 2 — How the argument was corrected four times / Argüman dört kez nasıl düzeltildi</w:t>
+      </w:r>
+    </w:p>
+    <w:p>
+      <w:r>
+        <w:rPr>
+          <w:rFonts w:ascii="Calibri" w:hAnsi="Calibri"/>
+          <w:b w:val="0"/>
+          <w:color w:val="333333"/>
+          <w:sz w:val="21"/>
+        </w:rPr>
+        <w:t>This section matters more than it looks. It is the strongest evidence that the analysis was checked rather than assumed, and it is the part to tell in person.</w:t>
+      </w:r>
+    </w:p>
+    <w:p>
+      <w:r>
+        <w:rPr>
+          <w:rFonts w:ascii="Calibri" w:hAnsi="Calibri"/>
+          <w:b/>
+          <w:color w:val="333333"/>
+          <w:sz w:val="21"/>
+        </w:rPr>
+        <w:t>First correction: "FSL is the outlier" was wrong.</w:t>
+      </w:r>
+      <w:r>
+        <w:rPr>
+          <w:rFonts w:ascii="Calibri" w:hAnsi="Calibri"/>
+          <w:b w:val="0"/>
+          <w:color w:val="333333"/>
+          <w:sz w:val="21"/>
+        </w:rPr>
+        <w:t xml:space="preserve"> MRtrix3's </w:t>
+      </w:r>
+      <w:r>
+        <w:rPr>
+          <w:rFonts w:ascii="Consolas" w:hAnsi="Consolas"/>
+          <w:color w:val="333333"/>
+          <w:sz w:val="21"/>
+        </w:rPr>
+        <w:t>dwi2tensor</w:t>
+      </w:r>
+      <w:r>
+        <w:rPr>
+          <w:rFonts w:ascii="Calibri" w:hAnsi="Calibri"/>
+          <w:b w:val="0"/>
+          <w:color w:val="333333"/>
+          <w:sz w:val="21"/>
+        </w:rPr>
+        <w:t xml:space="preserve"> performs weighted least squares followed by </w:t>
+      </w:r>
+      <w:r>
+        <w:rPr>
+          <w:rFonts w:ascii="Calibri" w:hAnsi="Calibri"/>
+          <w:b/>
+          <w:color w:val="333333"/>
+          <w:sz w:val="21"/>
+        </w:rPr>
+        <w:t>two reweighting iterations</w:t>
+      </w:r>
+      <w:r>
+        <w:rPr>
+          <w:rFonts w:ascii="Calibri" w:hAnsi="Calibri"/>
+          <w:b w:val="0"/>
+          <w:color w:val="333333"/>
+          <w:sz w:val="21"/>
+        </w:rPr>
+        <w:t xml:space="preserve"> by default. We had compared different algorithms and called the difference a toolkit effect. Constrained to one weighted fit (</w:t>
+      </w:r>
+      <w:r>
+        <w:rPr>
+          <w:rFonts w:ascii="Consolas" w:hAnsi="Consolas"/>
+          <w:color w:val="333333"/>
+          <w:sz w:val="21"/>
+        </w:rPr>
+        <w:t>-iter 0</w:t>
+      </w:r>
+      <w:r>
+        <w:rPr>
+          <w:rFonts w:ascii="Calibri" w:hAnsi="Calibri"/>
+          <w:b w:val="0"/>
+          <w:color w:val="333333"/>
+          <w:sz w:val="21"/>
+        </w:rPr>
+        <w:t xml:space="preserve">), MRtrix3 and FSL became identical and MRtrix3 moved away from DIPY. </w:t>
+      </w:r>
+      <w:r>
+        <w:rPr>
+          <w:rFonts w:ascii="Calibri" w:hAnsi="Calibri"/>
+          <w:i/>
+          <w:color w:val="333333"/>
+          <w:sz w:val="21"/>
+        </w:rPr>
+        <w:t>Found because the FA difference reversed sign between the two datasets.</w:t>
+      </w:r>
+    </w:p>
+    <w:p>
+      <w:r>
+        <w:rPr>
+          <w:rFonts w:ascii="Calibri" w:hAnsi="Calibri"/>
+          <w:b/>
+          <w:color w:val="333333"/>
+          <w:sz w:val="21"/>
+        </w:rPr>
+        <w:t>Second correction: "neither weighting is wrong" was wrong.</w:t>
+      </w:r>
+      <w:r>
+        <w:rPr>
+          <w:rFonts w:ascii="Calibri" w:hAnsi="Calibri"/>
+          <w:b w:val="0"/>
+          <w:color w:val="333333"/>
+          <w:sz w:val="21"/>
+        </w:rPr>
+        <w:t xml:space="preserve"> That rested on a phantom at SNR 30. The objection to measured-signal weighting is that the weights are correlated with the noise, so the bias scales as 1/SNR² — and SNR 30 is where it is smallest. At SNR 20 and 10 the effect appeared, and the MD bias grew 2.3-fold and 8.3-fold, against 2.25 and 9.00 predicted by the mechanism. </w:t>
+      </w:r>
+      <w:r>
+        <w:rPr>
+          <w:rFonts w:ascii="Calibri" w:hAnsi="Calibri"/>
+          <w:i/>
+          <w:color w:val="333333"/>
+          <w:sz w:val="21"/>
+        </w:rPr>
+        <w:t>Found because the result contradicted an established finding.</w:t>
+      </w:r>
+    </w:p>
+    <w:p>
+      <w:r>
+        <w:rPr>
+          <w:rFonts w:ascii="Calibri" w:hAnsi="Calibri"/>
+          <w:b/>
+          <w:color w:val="333333"/>
+          <w:sz w:val="21"/>
+        </w:rPr>
+        <w:t>Third correction: the simplified simulation, not the data, was the problem.</w:t>
+      </w:r>
+      <w:r>
+        <w:rPr>
+          <w:rFonts w:ascii="Calibri" w:hAnsi="Calibri"/>
+          <w:b w:val="0"/>
+          <w:color w:val="333333"/>
+          <w:sz w:val="21"/>
+        </w:rPr>
+        <w:t xml:space="preserve"> It predicted the opposite FA sign on Sherbrooke, and we reported that as unexplained. Its tensors had a fixed MD of 0.70 µm²/ms (the real median is 0.594), one symmetric shape, random orientation and uniform S₀ and σ. No single idealisation reverses the sign under every rule; all four together do. With each voxel's own tensor, S₀ and noise level, noise reproduces the observed sign.</w:t>
+      </w:r>
+    </w:p>
+    <w:p>
+      <w:r>
+        <w:rPr>
+          <w:rFonts w:ascii="Calibri" w:hAnsi="Calibri"/>
+          <w:b/>
+          <w:color w:val="333333"/>
+          <w:sz w:val="21"/>
+        </w:rPr>
+        <w:t>Fourth correction: we had been selecting on the outcome.</w:t>
+      </w:r>
+      <w:r>
+        <w:rPr>
+          <w:rFonts w:ascii="Calibri" w:hAnsi="Calibri"/>
+          <w:b w:val="0"/>
+          <w:color w:val="333333"/>
+          <w:sz w:val="21"/>
+        </w:rPr>
+        <w:t xml:space="preserve"> The first version of that analysis dropped a simulated voxel when the measured-signal fit came out non-physical — exactly where the offset is largest — and the voxel set had already been chosen the same way. It made noise look as though it explained only 60% of the Sherbrooke FA offset. With voxels and bins taken from the DIPY fit alone, and non-physical fits handled identically in observed and simulated data, noise reproduces 89–106% of it. </w:t>
+      </w:r>
+      <w:r>
+        <w:rPr>
+          <w:rFonts w:ascii="Calibri" w:hAnsi="Calibri"/>
+          <w:i/>
+          <w:color w:val="333333"/>
+          <w:sz w:val="21"/>
+        </w:rPr>
+        <w:t>Found by an independent code review.</w:t>
+      </w:r>
+    </w:p>
+    <w:p>
+      <w:r>
+        <w:rPr>
+          <w:rFonts w:ascii="Calibri" w:hAnsi="Calibri"/>
+          <w:b w:val="0"/>
+          <w:color w:val="333333"/>
+          <w:sz w:val="21"/>
+        </w:rPr>
+        <w:t xml:space="preserve">&gt; </w:t>
+      </w:r>
+      <w:r>
+        <w:rPr>
+          <w:rFonts w:ascii="Calibri" w:hAnsi="Calibri"/>
+          <w:b/>
+          <w:color w:val="333333"/>
+          <w:sz w:val="21"/>
+        </w:rPr>
+        <w:t>★ What the four have in common.</w:t>
+      </w:r>
+      <w:r>
+        <w:rPr>
+          <w:rFonts w:ascii="Calibri" w:hAnsi="Calibri"/>
+          <w:b w:val="0"/>
+          <w:color w:val="333333"/>
+          <w:sz w:val="21"/>
+        </w:rPr>
+        <w:t xml:space="preserve"> Every one came from assuming that two &gt; things with the same name were the same thing: "WLS" in three manuals meant &gt; three computations; "the phantom test" at one SNR meant something different &gt; from a test of a noise-dependent effect; "the simulation" meant an &gt; idealisation; "the voxels" meant a set already filtered by the arm under test. &gt; That is the paper's own subject, and we walked into it four times.</w:t>
+      </w:r>
+    </w:p>
+    <w:tbl>
+      <w:tblPr>
+        <w:tblW w:type="auto" w:w="0"/>
+        <w:jc w:val="center"/>
+        <w:tblLook w:firstColumn="1" w:firstRow="1" w:lastColumn="0" w:lastRow="0" w:noHBand="0" w:noVBand="1" w:val="04A0"/>
+        <w:tblBorders>
+          <w:top w:val="none" w:sz="0"/>
+          <w:left w:val="none" w:sz="0"/>
+          <w:bottom w:val="none" w:sz="0"/>
+          <w:right w:val="none" w:sz="0"/>
+          <w:insideH w:val="none" w:sz="0"/>
+          <w:insideV w:val="none" w:sz="0"/>
+        </w:tblBorders>
+      </w:tblPr>
+      <w:tblGrid>
+        <w:gridCol w:w="9858"/>
+      </w:tblGrid>
+      <w:tr>
+        <w:tc>
+          <w:tcPr>
+            <w:tcW w:type="dxa" w:w="9858"/>
+            <w:shd w:val="clear" w:fill="EEF6F2"/>
+          </w:tcPr>
+          <w:p>
+            <w:pPr>
+              <w:spacing w:after="60"/>
+            </w:pPr>
+            <w:r>
+              <w:rPr>
+                <w:rFonts w:ascii="Calibri" w:hAnsi="Calibri"/>
+                <w:b w:val="0"/>
+                <w:color w:val="1B4D3E"/>
+                <w:sz w:val="21"/>
+              </w:rPr>
+              <w:t>Bu bölüm göründüğünden önemli. Analizin varsayılmak yerine kontrol edildiğinin en güçlü kanıtı, ve yüz yüze anlatılacak kısım burası.</w:t>
             </w:r>
           </w:p>
         </w:tc>
@@ -1132,11 +1224,20 @@
             <w:r>
               <w:rPr>
                 <w:rFonts w:ascii="Calibri" w:hAnsi="Calibri"/>
+                <w:b/>
+                <w:color w:val="1B4D3E"/>
+                <w:sz w:val="21"/>
+              </w:rPr>
+              <w:t>Birinci düzeltme: "FSL aykırı" yanlıştı.</w:t>
+            </w:r>
+            <w:r>
+              <w:rPr>
+                <w:rFonts w:ascii="Calibri" w:hAnsi="Calibri"/>
                 <w:b w:val="0"/>
                 <w:color w:val="1B4D3E"/>
                 <w:sz w:val="21"/>
               </w:rPr>
-              <w:t xml:space="preserve">1. </w:t>
+              <w:t xml:space="preserve"> MRtrix3 varsayılanda ağırlıklı en küçük kareler ve ardından </w:t>
             </w:r>
             <w:r>
               <w:rPr>
@@ -1145,7 +1246,7 @@
                 <w:color w:val="1B4D3E"/>
                 <w:sz w:val="21"/>
               </w:rPr>
-              <w:t>Değişken uygulama değil.</w:t>
+              <w:t>iki yeniden ağırlıklandırma</w:t>
             </w:r>
             <w:r>
               <w:rPr>
@@ -1154,7 +1255,24 @@
                 <w:color w:val="1B4D3E"/>
                 <w:sz w:val="21"/>
               </w:rPr>
-              <w:t xml:space="preserve"> FSL ve MRtrix3, aynı estimator verildiğinde </w:t>
+              <w:t xml:space="preserve"> yapıyor. Farklı algoritmaları karşılaştırıp farkı araca atfetmişiz. </w:t>
+            </w:r>
+            <w:r>
+              <w:rPr>
+                <w:rFonts w:ascii="Consolas" w:hAnsi="Consolas"/>
+                <w:color w:val="1B4D3E"/>
+                <w:sz w:val="21"/>
+              </w:rPr>
+              <w:t>-iter 0</w:t>
+            </w:r>
+            <w:r>
+              <w:rPr>
+                <w:rFonts w:ascii="Calibri" w:hAnsi="Calibri"/>
+                <w:b w:val="0"/>
+                <w:color w:val="1B4D3E"/>
+                <w:sz w:val="21"/>
+              </w:rPr>
+              <w:t xml:space="preserve"> ile MRtrix3 ve FSL özdeş oldu, MRtrix3 DIPY'den uzaklaştı. </w:t>
             </w:r>
             <w:r>
               <w:rPr>
@@ -1163,69 +1281,7 @@
                 <w:color w:val="1B4D3E"/>
                 <w:sz w:val="21"/>
               </w:rPr>
-              <w:t>özdeş</w:t>
-            </w:r>
-            <w:r>
-              <w:rPr>
-                <w:rFonts w:ascii="Calibri" w:hAnsi="Calibri"/>
-                <w:b w:val="0"/>
-                <w:color w:val="1B4D3E"/>
-                <w:sz w:val="21"/>
-              </w:rPr>
-              <w:t xml:space="preserve"> tensör üretiyor — r = 1.0000, MAE = 0.0000. İki bağımsız kod tabanı, aynı cevap. 2. </w:t>
-            </w:r>
-            <w:r>
-              <w:rPr>
-                <w:rFonts w:ascii="Calibri" w:hAnsi="Calibri"/>
-                <w:b/>
-                <w:color w:val="1B4D3E"/>
-                <w:sz w:val="21"/>
-              </w:rPr>
-              <w:t>Değişken varsayılan.</w:t>
-            </w:r>
-            <w:r>
-              <w:rPr>
-                <w:rFonts w:ascii="Calibri" w:hAnsi="Calibri"/>
-                <w:b w:val="0"/>
-                <w:color w:val="1B4D3E"/>
-                <w:sz w:val="21"/>
-              </w:rPr>
-              <w:t xml:space="preserve"> MRtrix3 ve DIPY tavsiye edileni dağıtıyor. FSL sıradan en küçük kareleri, ve </w:t>
-            </w:r>
-            <w:r>
-              <w:rPr>
-                <w:rFonts w:ascii="Consolas" w:hAnsi="Consolas"/>
-                <w:color w:val="1B4D3E"/>
-                <w:sz w:val="21"/>
-              </w:rPr>
-              <w:t>--wls</w:t>
-            </w:r>
-            <w:r>
-              <w:rPr>
-                <w:rFonts w:ascii="Calibri" w:hAnsi="Calibri"/>
-                <w:b w:val="0"/>
-                <w:color w:val="1B4D3E"/>
-                <w:sz w:val="21"/>
-              </w:rPr>
-              <w:t xml:space="preserve"> seçeneği Veraart'ın kaçınılmasını söylediğini. Kullanıcı bunu komuttan göremiyor. 3. </w:t>
-            </w:r>
-            <w:r>
-              <w:rPr>
-                <w:rFonts w:ascii="Calibri" w:hAnsi="Calibri"/>
-                <w:b/>
-                <w:color w:val="1B4D3E"/>
-                <w:sz w:val="21"/>
-              </w:rPr>
-              <w:t>Gerçekçi gürültüde önemli.</w:t>
-            </w:r>
-            <w:r>
-              <w:rPr>
-                <w:rFonts w:ascii="Calibri" w:hAnsi="Calibri"/>
-                <w:b w:val="0"/>
-                <w:color w:val="1B4D3E"/>
-                <w:sz w:val="21"/>
-              </w:rPr>
-              <w:t xml:space="preserve"> SNR 30'da iki şema denk. SNR 10'da ölçülen-sinyal şeması yaklaşık iki kat MD yanlılığı taşıyor. Yüksek b-değerli gerçek veri SNR 10'a daha yakın.</w:t>
+              <w:t>Fark edilme sebebi: FA farkı iki veri seti arasında işaret değiştiriyordu.</w:t>
             </w:r>
           </w:p>
         </w:tc>
@@ -1265,7 +1321,7 @@
                 <w:color w:val="1B4D3E"/>
                 <w:sz w:val="21"/>
               </w:rPr>
-              <w:t>Özet:</w:t>
+              <w:t>İkinci düzeltme: "hiçbir ağırlıklandırma yanlış değil" yanlıştı.</w:t>
             </w:r>
             <w:r>
               <w:rPr>
@@ -1274,300 +1330,16 @@
                 <w:color w:val="1B4D3E"/>
                 <w:sz w:val="21"/>
               </w:rPr>
-              <w:t xml:space="preserve"> FSL içinde tek bayrak değiştirmek, FSL'i başka bir araçla tamamen değiştirmekten daha çok FA kaydırıyor.</w:t>
-            </w:r>
-          </w:p>
-        </w:tc>
-      </w:tr>
-    </w:tbl>
-    <w:p>
-      <w:pPr>
-        <w:spacing w:after="160"/>
-      </w:pPr>
-      <w:r>
-        <w:rPr>
-          <w:b/>
-          <w:color w:val="16213E"/>
-          <w:sz w:val="32"/>
-        </w:rPr>
-        <w:t>PART 2 — How the argument was corrected twice / Argüman nasıl iki kez düzeltildi</w:t>
-      </w:r>
-    </w:p>
-    <w:p>
-      <w:r>
-        <w:rPr>
-          <w:rFonts w:ascii="Calibri" w:hAnsi="Calibri"/>
-          <w:b w:val="0"/>
-          <w:color w:val="333333"/>
-          <w:sz w:val="21"/>
-        </w:rPr>
-        <w:t>This section matters more than it looks. It is the strongest evidence that the analysis was done carefully, and it is the part to tell in person.</w:t>
-      </w:r>
-    </w:p>
-    <w:tbl>
-      <w:tblPr>
-        <w:tblW w:type="auto" w:w="0"/>
-        <w:jc w:val="center"/>
-        <w:tblLook w:firstColumn="1" w:firstRow="1" w:lastColumn="0" w:lastRow="0" w:noHBand="0" w:noVBand="1" w:val="04A0"/>
-        <w:tblBorders>
-          <w:top w:val="none" w:sz="0"/>
-          <w:left w:val="none" w:sz="0"/>
-          <w:bottom w:val="none" w:sz="0"/>
-          <w:right w:val="none" w:sz="0"/>
-          <w:insideH w:val="none" w:sz="0"/>
-          <w:insideV w:val="none" w:sz="0"/>
-        </w:tblBorders>
-      </w:tblPr>
-      <w:tblGrid>
-        <w:gridCol w:w="9858"/>
-      </w:tblGrid>
-      <w:tr>
-        <w:tc>
-          <w:tcPr>
-            <w:tcW w:type="dxa" w:w="9858"/>
-            <w:shd w:val="clear" w:fill="EEF6F2"/>
-          </w:tcPr>
-          <w:p>
-            <w:pPr>
-              <w:spacing w:after="60"/>
-            </w:pPr>
+              <w:t xml:space="preserve"> Bu, SNR 30'daki bir fantoma dayanıyordu. Oysa kusur gürültüye bağlı ve yanlılık 1/SNR² ile ölçekleniyor; SNR 30 tam da en küçük olduğu yer. SNR 20 ve 10'da etki göründü: MD yanlılığı 2.3 ve 8.3 kat büyüdü, mekanizmanın öngördüğü 2.25 ve 9.00'a karşı. </w:t>
+            </w:r>
             <w:r>
               <w:rPr>
                 <w:rFonts w:ascii="Calibri" w:hAnsi="Calibri"/>
-                <w:b w:val="0"/>
+                <w:i/>
                 <w:color w:val="1B4D3E"/>
                 <w:sz w:val="21"/>
               </w:rPr>
-              <w:t>Bu bölüm göründüğünden önemli. Analizin dikkatli yapıldığının en güçlü kanıtı, ve yüz yüze anlatılacak kısım burası.</w:t>
-            </w:r>
-          </w:p>
-        </w:tc>
-      </w:tr>
-    </w:tbl>
-    <w:p>
-      <w:pPr>
-        <w:spacing w:before="160"/>
-      </w:pPr>
-      <w:r>
-        <w:rPr>
-          <w:b/>
-          <w:color w:val="0F4C81"/>
-          <w:sz w:val="25"/>
-        </w:rPr>
-        <w:t>First conclusion, which was wrong / Birinci sonuç, ki yanlıştı</w:t>
-      </w:r>
-    </w:p>
-    <w:p>
-      <w:r>
-        <w:rPr>
-          <w:rFonts w:ascii="Calibri" w:hAnsi="Calibri"/>
-          <w:b/>
-          <w:color w:val="333333"/>
-          <w:sz w:val="21"/>
-        </w:rPr>
-        <w:t>EN.</w:t>
-      </w:r>
-      <w:r>
-        <w:rPr>
-          <w:rFonts w:ascii="Calibri" w:hAnsi="Calibri"/>
-          <w:b w:val="0"/>
-          <w:color w:val="333333"/>
-          <w:sz w:val="21"/>
-        </w:rPr>
-        <w:t xml:space="preserve"> Running each toolkit as a user normally would, the result looked clear: MRtrix3 and DIPY agreed closely (r = 0.9990), FSL sat apart from both (r = 0.96). The obvious reading was "FSL is the outlier."</w:t>
-      </w:r>
-    </w:p>
-    <w:p>
-      <w:r>
-        <w:rPr>
-          <w:rFonts w:ascii="Calibri" w:hAnsi="Calibri"/>
-          <w:b w:val="0"/>
-          <w:color w:val="333333"/>
-          <w:sz w:val="21"/>
-        </w:rPr>
-        <w:t xml:space="preserve">Two things did not fit. The FA offset </w:t>
-      </w:r>
-      <w:r>
-        <w:rPr>
-          <w:rFonts w:ascii="Calibri" w:hAnsi="Calibri"/>
-          <w:i/>
-          <w:color w:val="333333"/>
-          <w:sz w:val="21"/>
-        </w:rPr>
-        <w:t>reversed sign</w:t>
-      </w:r>
-      <w:r>
-        <w:rPr>
-          <w:rFonts w:ascii="Calibri" w:hAnsi="Calibri"/>
-          <w:b w:val="0"/>
-          <w:color w:val="333333"/>
-          <w:sz w:val="21"/>
-        </w:rPr>
-        <w:t xml:space="preserve"> between the two datasets — FSL lower on Stanford, higher on Sherbrooke. A genuine implementation difference should not flip direction with the acquisition.</w:t>
-      </w:r>
-    </w:p>
-    <w:p>
-      <w:r>
-        <w:rPr>
-          <w:rFonts w:ascii="Calibri" w:hAnsi="Calibri"/>
-          <w:b/>
-          <w:color w:val="333333"/>
-          <w:sz w:val="21"/>
-        </w:rPr>
-        <w:t>The check:</w:t>
-      </w:r>
-      <w:r>
-        <w:rPr>
-          <w:rFonts w:ascii="Calibri" w:hAnsi="Calibri"/>
-          <w:b w:val="0"/>
-          <w:color w:val="333333"/>
-          <w:sz w:val="21"/>
-        </w:rPr>
-        <w:t xml:space="preserve"> MRtrix3's documentation says </w:t>
-      </w:r>
-      <w:r>
-        <w:rPr>
-          <w:rFonts w:ascii="Consolas" w:hAnsi="Consolas"/>
-          <w:color w:val="333333"/>
-          <w:sz w:val="21"/>
-        </w:rPr>
-        <w:t>dwi2tensor</w:t>
-      </w:r>
-      <w:r>
-        <w:rPr>
-          <w:rFonts w:ascii="Calibri" w:hAnsi="Calibri"/>
-          <w:b w:val="0"/>
-          <w:color w:val="333333"/>
-          <w:sz w:val="21"/>
-        </w:rPr>
-        <w:t xml:space="preserve"> performs WLS followed by </w:t>
-      </w:r>
-      <w:r>
-        <w:rPr>
-          <w:rFonts w:ascii="Calibri" w:hAnsi="Calibri"/>
-          <w:b/>
-          <w:color w:val="333333"/>
-          <w:sz w:val="21"/>
-        </w:rPr>
-        <w:t>two iterations of reweighting</w:t>
-      </w:r>
-      <w:r>
-        <w:rPr>
-          <w:rFonts w:ascii="Calibri" w:hAnsi="Calibri"/>
-          <w:b w:val="0"/>
-          <w:color w:val="333333"/>
-          <w:sz w:val="21"/>
-        </w:rPr>
-        <w:t xml:space="preserve"> by default. FSL </w:t>
-      </w:r>
-      <w:r>
-        <w:rPr>
-          <w:rFonts w:ascii="Consolas" w:hAnsi="Consolas"/>
-          <w:color w:val="333333"/>
-          <w:sz w:val="21"/>
-        </w:rPr>
-        <w:t>--wls</w:t>
-      </w:r>
-      <w:r>
-        <w:rPr>
-          <w:rFonts w:ascii="Calibri" w:hAnsi="Calibri"/>
-          <w:b w:val="0"/>
-          <w:color w:val="333333"/>
-          <w:sz w:val="21"/>
-        </w:rPr>
-        <w:t xml:space="preserve"> and DIPY do a single weighted fit. We had been comparing different algorithms and calling the difference a toolkit effect.</w:t>
-      </w:r>
-    </w:p>
-    <w:p>
-      <w:r>
-        <w:rPr>
-          <w:rFonts w:ascii="Calibri" w:hAnsi="Calibri"/>
-          <w:b w:val="0"/>
-          <w:color w:val="333333"/>
-          <w:sz w:val="21"/>
-        </w:rPr>
-        <w:t xml:space="preserve">Rerunning MRtrix3 with </w:t>
-      </w:r>
-      <w:r>
-        <w:rPr>
-          <w:rFonts w:ascii="Consolas" w:hAnsi="Consolas"/>
-          <w:color w:val="333333"/>
-          <w:sz w:val="21"/>
-        </w:rPr>
-        <w:t>-iter 0</w:t>
-      </w:r>
-      <w:r>
-        <w:rPr>
-          <w:rFonts w:ascii="Calibri" w:hAnsi="Calibri"/>
-          <w:b w:val="0"/>
-          <w:color w:val="333333"/>
-          <w:sz w:val="21"/>
-        </w:rPr>
-        <w:t xml:space="preserve"> reversed the grouping completely: FSL and MRtrix3 became </w:t>
-      </w:r>
-      <w:r>
-        <w:rPr>
-          <w:rFonts w:ascii="Calibri" w:hAnsi="Calibri"/>
-          <w:i/>
-          <w:color w:val="333333"/>
-          <w:sz w:val="21"/>
-        </w:rPr>
-        <w:t>identical</w:t>
-      </w:r>
-      <w:r>
-        <w:rPr>
-          <w:rFonts w:ascii="Calibri" w:hAnsi="Calibri"/>
-          <w:b w:val="0"/>
-          <w:color w:val="333333"/>
-          <w:sz w:val="21"/>
-        </w:rPr>
-        <w:t xml:space="preserve"> (r = 1.0000), and MRtrix3 moved away from DIPY.</w:t>
-      </w:r>
-    </w:p>
-    <w:tbl>
-      <w:tblPr>
-        <w:tblW w:type="auto" w:w="0"/>
-        <w:jc w:val="center"/>
-        <w:tblLook w:firstColumn="1" w:firstRow="1" w:lastColumn="0" w:lastRow="0" w:noHBand="0" w:noVBand="1" w:val="04A0"/>
-        <w:tblBorders>
-          <w:top w:val="none" w:sz="0"/>
-          <w:left w:val="none" w:sz="0"/>
-          <w:bottom w:val="none" w:sz="0"/>
-          <w:right w:val="none" w:sz="0"/>
-          <w:insideH w:val="none" w:sz="0"/>
-          <w:insideV w:val="none" w:sz="0"/>
-        </w:tblBorders>
-      </w:tblPr>
-      <w:tblGrid>
-        <w:gridCol w:w="9858"/>
-      </w:tblGrid>
-      <w:tr>
-        <w:tc>
-          <w:tcPr>
-            <w:tcW w:type="dxa" w:w="9858"/>
-            <w:shd w:val="clear" w:fill="EEF6F2"/>
-          </w:tcPr>
-          <w:p>
-            <w:pPr>
-              <w:spacing w:after="60"/>
-            </w:pPr>
-            <w:r>
-              <w:rPr>
-                <w:rFonts w:ascii="Calibri" w:hAnsi="Calibri"/>
-                <w:b/>
-                <w:color w:val="1B4D3E"/>
-                <w:sz w:val="21"/>
-              </w:rPr>
-              <w:t>TR.</w:t>
-            </w:r>
-            <w:r>
-              <w:rPr>
-                <w:rFonts w:ascii="Calibri" w:hAnsi="Calibri"/>
-                <w:b w:val="0"/>
-                <w:color w:val="1B4D3E"/>
-                <w:sz w:val="21"/>
-              </w:rPr>
-              <w:t xml:space="preserve"> Her aracı kullanıcının normalde çalıştıracağı gibi çalıştırınca sonuç net görünüyordu: MRtrix3 ve DIPY yakın (r = 0.9990), FSL ikisinden de uzak (r = 0.96). Bariz okuma "FSL aykırı" idi.</w:t>
+              <w:t>Fark edilme sebebi: yerleşik bir bulguyla çelişiyorduk.</w:t>
             </w:r>
           </w:p>
         </w:tc>
@@ -1603,20 +1375,11 @@
             <w:r>
               <w:rPr>
                 <w:rFonts w:ascii="Calibri" w:hAnsi="Calibri"/>
-                <w:b w:val="0"/>
-                <w:color w:val="1B4D3E"/>
-                <w:sz w:val="21"/>
-              </w:rPr>
-              <w:t xml:space="preserve">İki şey uymuyordu. FA kayması iki veri seti arasında </w:t>
-            </w:r>
-            <w:r>
-              <w:rPr>
-                <w:rFonts w:ascii="Calibri" w:hAnsi="Calibri"/>
                 <w:b/>
                 <w:color w:val="1B4D3E"/>
                 <w:sz w:val="21"/>
               </w:rPr>
-              <w:t>işaret değiştiriyordu</w:t>
+              <w:t>Üçüncü düzeltme: sorun veride değil, basit simülasyondaydı.</w:t>
             </w:r>
             <w:r>
               <w:rPr>
@@ -1625,7 +1388,7 @@
                 <w:color w:val="1B4D3E"/>
                 <w:sz w:val="21"/>
               </w:rPr>
-              <w:t xml:space="preserve"> — Stanford'da FSL düşük, Sherbrooke'ta yüksek. Gerçek bir uygulama farkı edinime göre yön değiştirmez.</w:t>
+              <w:t xml:space="preserve"> Simülasyon Sherbrooke'ta ters FA işareti öngörüyordu ve bunu açıklanamadı diye yazmıştık. Oysa tensörleri sabit MD = 0.70 µm²/ms (gerçek ortanca 0.594), tek bir simetrik şekil, rastgele yön ve her yerde aynı S₀ ve σ içeriyordu. Hiçbir idealleştirme tek başına her kuralda işareti çevirmiyor; dördü birlikte çeviriyor.</w:t>
             </w:r>
           </w:p>
         </w:tc>
@@ -1665,7 +1428,7 @@
                 <w:color w:val="1B4D3E"/>
                 <w:sz w:val="21"/>
               </w:rPr>
-              <w:t>Kontrol:</w:t>
+              <w:t>Dördüncü düzeltme: seçimi sonuca göre yapıyormuşuz.</w:t>
             </w:r>
             <w:r>
               <w:rPr>
@@ -1674,316 +1437,7 @@
                 <w:color w:val="1B4D3E"/>
                 <w:sz w:val="21"/>
               </w:rPr>
-              <w:t xml:space="preserve"> MRtrix3 belgesi </w:t>
-            </w:r>
-            <w:r>
-              <w:rPr>
-                <w:rFonts w:ascii="Consolas" w:hAnsi="Consolas"/>
-                <w:color w:val="1B4D3E"/>
-                <w:sz w:val="21"/>
-              </w:rPr>
-              <w:t>dwi2tensor</w:t>
-            </w:r>
-            <w:r>
-              <w:rPr>
-                <w:rFonts w:ascii="Calibri" w:hAnsi="Calibri"/>
-                <w:b w:val="0"/>
-                <w:color w:val="1B4D3E"/>
-                <w:sz w:val="21"/>
-              </w:rPr>
-              <w:t xml:space="preserve">'ün varsayılanda WLS + </w:t>
-            </w:r>
-            <w:r>
-              <w:rPr>
-                <w:rFonts w:ascii="Calibri" w:hAnsi="Calibri"/>
-                <w:b/>
-                <w:color w:val="1B4D3E"/>
-                <w:sz w:val="21"/>
-              </w:rPr>
-              <w:t>iki yeniden ağırlıklandırma iterasyonu</w:t>
-            </w:r>
-            <w:r>
-              <w:rPr>
-                <w:rFonts w:ascii="Calibri" w:hAnsi="Calibri"/>
-                <w:b w:val="0"/>
-                <w:color w:val="1B4D3E"/>
-                <w:sz w:val="21"/>
-              </w:rPr>
-              <w:t xml:space="preserve"> yaptığını söylüyor. FSL </w:t>
-            </w:r>
-            <w:r>
-              <w:rPr>
-                <w:rFonts w:ascii="Consolas" w:hAnsi="Consolas"/>
-                <w:color w:val="1B4D3E"/>
-                <w:sz w:val="21"/>
-              </w:rPr>
-              <w:t>--wls</w:t>
-            </w:r>
-            <w:r>
-              <w:rPr>
-                <w:rFonts w:ascii="Calibri" w:hAnsi="Calibri"/>
-                <w:b w:val="0"/>
-                <w:color w:val="1B4D3E"/>
-                <w:sz w:val="21"/>
-              </w:rPr>
-              <w:t xml:space="preserve"> ve DIPY tek ağırlıklı fit yapıyor. Farklı algoritmaları karşılaştırıp farkı araç etkisi sanmışız.</w:t>
-            </w:r>
-          </w:p>
-        </w:tc>
-      </w:tr>
-    </w:tbl>
-    <w:tbl>
-      <w:tblPr>
-        <w:tblW w:type="auto" w:w="0"/>
-        <w:jc w:val="center"/>
-        <w:tblLook w:firstColumn="1" w:firstRow="1" w:lastColumn="0" w:lastRow="0" w:noHBand="0" w:noVBand="1" w:val="04A0"/>
-        <w:tblBorders>
-          <w:top w:val="none" w:sz="0"/>
-          <w:left w:val="none" w:sz="0"/>
-          <w:bottom w:val="none" w:sz="0"/>
-          <w:right w:val="none" w:sz="0"/>
-          <w:insideH w:val="none" w:sz="0"/>
-          <w:insideV w:val="none" w:sz="0"/>
-        </w:tblBorders>
-      </w:tblPr>
-      <w:tblGrid>
-        <w:gridCol w:w="9858"/>
-      </w:tblGrid>
-      <w:tr>
-        <w:tc>
-          <w:tcPr>
-            <w:tcW w:type="dxa" w:w="9858"/>
-            <w:shd w:val="clear" w:fill="EEF6F2"/>
-          </w:tcPr>
-          <w:p>
-            <w:pPr>
-              <w:spacing w:after="60"/>
-            </w:pPr>
-            <w:r>
-              <w:rPr>
-                <w:rFonts w:ascii="Calibri" w:hAnsi="Calibri"/>
-                <w:b w:val="0"/>
-                <w:color w:val="1B4D3E"/>
-                <w:sz w:val="21"/>
-              </w:rPr>
-              <w:t xml:space="preserve">MRtrix3'ü </w:t>
-            </w:r>
-            <w:r>
-              <w:rPr>
-                <w:rFonts w:ascii="Consolas" w:hAnsi="Consolas"/>
-                <w:color w:val="1B4D3E"/>
-                <w:sz w:val="21"/>
-              </w:rPr>
-              <w:t>-iter 0</w:t>
-            </w:r>
-            <w:r>
-              <w:rPr>
-                <w:rFonts w:ascii="Calibri" w:hAnsi="Calibri"/>
-                <w:b w:val="0"/>
-                <w:color w:val="1B4D3E"/>
-                <w:sz w:val="21"/>
-              </w:rPr>
-              <w:t xml:space="preserve"> ile tekrar çalıştırınca gruplaşma tamamen tersine döndü: FSL ve MRtrix3 </w:t>
-            </w:r>
-            <w:r>
-              <w:rPr>
-                <w:rFonts w:ascii="Calibri" w:hAnsi="Calibri"/>
-                <w:b/>
-                <w:color w:val="1B4D3E"/>
-                <w:sz w:val="21"/>
-              </w:rPr>
-              <w:t>özdeş</w:t>
-            </w:r>
-            <w:r>
-              <w:rPr>
-                <w:rFonts w:ascii="Calibri" w:hAnsi="Calibri"/>
-                <w:b w:val="0"/>
-                <w:color w:val="1B4D3E"/>
-                <w:sz w:val="21"/>
-              </w:rPr>
-              <w:t xml:space="preserve"> oldu (r = 1.0000), MRtrix3 DIPY'den uzaklaştı.</w:t>
-            </w:r>
-          </w:p>
-        </w:tc>
-      </w:tr>
-    </w:tbl>
-    <w:p>
-      <w:pPr>
-        <w:spacing w:before="160"/>
-      </w:pPr>
-      <w:r>
-        <w:rPr>
-          <w:b/>
-          <w:color w:val="0F4C81"/>
-          <w:sz w:val="25"/>
-        </w:rPr>
-        <w:t>Second conclusion, also wrong / İkinci sonuç, o da yanlıştı</w:t>
-      </w:r>
-    </w:p>
-    <w:p>
-      <w:r>
-        <w:rPr>
-          <w:rFonts w:ascii="Calibri" w:hAnsi="Calibri"/>
-          <w:b/>
-          <w:color w:val="333333"/>
-          <w:sz w:val="21"/>
-        </w:rPr>
-        <w:t>EN.</w:t>
-      </w:r>
-      <w:r>
-        <w:rPr>
-          <w:rFonts w:ascii="Calibri" w:hAnsi="Calibri"/>
-          <w:b w:val="0"/>
-          <w:color w:val="333333"/>
-          <w:sz w:val="21"/>
-        </w:rPr>
-        <w:t xml:space="preserve"> With the estimator matched, DIPY still differed. We found why — DIPY weights by a predicted signal, the others by the measured signal — and confirmed it by giving DIPY measured-signal weights, which cut the disagreement by 98%.</w:t>
-      </w:r>
-    </w:p>
-    <w:p>
-      <w:r>
-        <w:rPr>
-          <w:rFonts w:ascii="Calibri" w:hAnsi="Calibri"/>
-          <w:b w:val="0"/>
-          <w:color w:val="333333"/>
-          <w:sz w:val="21"/>
-        </w:rPr>
-        <w:t xml:space="preserve">We then tested accuracy on a phantom at SNR 30 and found both schemes recover the truth to within 0.002 FA. So we wrote: </w:t>
-      </w:r>
-      <w:r>
-        <w:rPr>
-          <w:rFonts w:ascii="Calibri" w:hAnsi="Calibri"/>
-          <w:i/>
-          <w:color w:val="333333"/>
-          <w:sz w:val="21"/>
-        </w:rPr>
-        <w:t>neither weighting is wrong</w:t>
-      </w:r>
-      <w:r>
-        <w:rPr>
-          <w:rFonts w:ascii="Calibri" w:hAnsi="Calibri"/>
-          <w:b w:val="0"/>
-          <w:color w:val="333333"/>
-          <w:sz w:val="21"/>
-        </w:rPr>
-        <w:t>.</w:t>
-      </w:r>
-    </w:p>
-    <w:p>
-      <w:r>
-        <w:rPr>
-          <w:rFonts w:ascii="Calibri" w:hAnsi="Calibri"/>
-          <w:b/>
-          <w:color w:val="333333"/>
-          <w:sz w:val="21"/>
-        </w:rPr>
-        <w:t>That was wrong too.</w:t>
-      </w:r>
-      <w:r>
-        <w:rPr>
-          <w:rFonts w:ascii="Calibri" w:hAnsi="Calibri"/>
-          <w:b w:val="0"/>
-          <w:color w:val="333333"/>
-          <w:sz w:val="21"/>
-        </w:rPr>
-        <w:t xml:space="preserve"> Veraart et al. (2013) had compared exactly these two schemes and found the measured-signal one "surprisingly" damaging to accuracy. Our phantom missed it because SNR 30 is a favourable regime — the whole point is that the weights are contaminated by noise, so the effect only appears when there is enough noise.</w:t>
-      </w:r>
-    </w:p>
-    <w:p>
-      <w:r>
-        <w:rPr>
-          <w:rFonts w:ascii="Calibri" w:hAnsi="Calibri"/>
-          <w:b w:val="0"/>
-          <w:color w:val="333333"/>
-          <w:sz w:val="21"/>
-        </w:rPr>
-        <w:t>Rerunning at SNR 20 and 10 reproduced Veraart's result cleanly.</w:t>
-      </w:r>
-    </w:p>
-    <w:tbl>
-      <w:tblPr>
-        <w:tblW w:type="auto" w:w="0"/>
-        <w:jc w:val="center"/>
-        <w:tblLook w:firstColumn="1" w:firstRow="1" w:lastColumn="0" w:lastRow="0" w:noHBand="0" w:noVBand="1" w:val="04A0"/>
-        <w:tblBorders>
-          <w:top w:val="none" w:sz="0"/>
-          <w:left w:val="none" w:sz="0"/>
-          <w:bottom w:val="none" w:sz="0"/>
-          <w:right w:val="none" w:sz="0"/>
-          <w:insideH w:val="none" w:sz="0"/>
-          <w:insideV w:val="none" w:sz="0"/>
-        </w:tblBorders>
-      </w:tblPr>
-      <w:tblGrid>
-        <w:gridCol w:w="9858"/>
-      </w:tblGrid>
-      <w:tr>
-        <w:tc>
-          <w:tcPr>
-            <w:tcW w:type="dxa" w:w="9858"/>
-            <w:shd w:val="clear" w:fill="EEF6F2"/>
-          </w:tcPr>
-          <w:p>
-            <w:pPr>
-              <w:spacing w:after="60"/>
-            </w:pPr>
-            <w:r>
-              <w:rPr>
-                <w:rFonts w:ascii="Calibri" w:hAnsi="Calibri"/>
-                <w:b/>
-                <w:color w:val="1B4D3E"/>
-                <w:sz w:val="21"/>
-              </w:rPr>
-              <w:t>TR.</w:t>
-            </w:r>
-            <w:r>
-              <w:rPr>
-                <w:rFonts w:ascii="Calibri" w:hAnsi="Calibri"/>
-                <w:b w:val="0"/>
-                <w:color w:val="1B4D3E"/>
-                <w:sz w:val="21"/>
-              </w:rPr>
-              <w:t xml:space="preserve"> Estimator eşitlenince DIPY hâlâ farklıydı. Sebebini bulduk — DIPY tahmin edilen sinyalle, diğerleri ölçülenle ağırlıklandırıyor — ve DIPY'ye ölçülen-sinyal ağırlığı vererek doğruladık: fark %98 kapandı.</w:t>
-            </w:r>
-          </w:p>
-        </w:tc>
-      </w:tr>
-    </w:tbl>
-    <w:tbl>
-      <w:tblPr>
-        <w:tblW w:type="auto" w:w="0"/>
-        <w:jc w:val="center"/>
-        <w:tblLook w:firstColumn="1" w:firstRow="1" w:lastColumn="0" w:lastRow="0" w:noHBand="0" w:noVBand="1" w:val="04A0"/>
-        <w:tblBorders>
-          <w:top w:val="none" w:sz="0"/>
-          <w:left w:val="none" w:sz="0"/>
-          <w:bottom w:val="none" w:sz="0"/>
-          <w:right w:val="none" w:sz="0"/>
-          <w:insideH w:val="none" w:sz="0"/>
-          <w:insideV w:val="none" w:sz="0"/>
-        </w:tblBorders>
-      </w:tblPr>
-      <w:tblGrid>
-        <w:gridCol w:w="9858"/>
-      </w:tblGrid>
-      <w:tr>
-        <w:tc>
-          <w:tcPr>
-            <w:tcW w:type="dxa" w:w="9858"/>
-            <w:shd w:val="clear" w:fill="EEF6F2"/>
-          </w:tcPr>
-          <w:p>
-            <w:pPr>
-              <w:spacing w:after="60"/>
-            </w:pPr>
-            <w:r>
-              <w:rPr>
-                <w:rFonts w:ascii="Calibri" w:hAnsi="Calibri"/>
-                <w:b w:val="0"/>
-                <w:color w:val="1B4D3E"/>
-                <w:sz w:val="21"/>
-              </w:rPr>
-              <w:t xml:space="preserve">Sonra SNR 30'da fantomda doğruluğu test ettik, ikisinin de gerçeği 0.002 FA içinde bulduğunu gördük. Ve yazdık: </w:t>
+              <w:t xml:space="preserve"> İlk sürümde, ölçülen sinyal fit'i fiziksel olmayan bir değer verince voksel atılıyordu; yani farkın en büyük olduğu yer. Voksel kümesi de aynı şekilde seçilmişti. Bu, gürültünün Sherbrooke FA farkının yalnızca %60'ını açıkladığı izlenimini veriyordu. Voksel kümesi ve binler yalnızca DIPY fit'inden alınınca, ve fiziksel olmayan fit'ler gözlenen ve simüle veride aynı şekilde ele alınınca, gürültü farkın %89–106'sını üretiyor. </w:t>
             </w:r>
             <w:r>
               <w:rPr>
@@ -1992,181 +1446,7 @@
                 <w:color w:val="1B4D3E"/>
                 <w:sz w:val="21"/>
               </w:rPr>
-              <w:t>hiçbiri yanlış değil</w:t>
-            </w:r>
-            <w:r>
-              <w:rPr>
-                <w:rFonts w:ascii="Calibri" w:hAnsi="Calibri"/>
-                <w:b w:val="0"/>
-                <w:color w:val="1B4D3E"/>
-                <w:sz w:val="21"/>
-              </w:rPr>
-              <w:t>.</w:t>
-            </w:r>
-          </w:p>
-        </w:tc>
-      </w:tr>
-    </w:tbl>
-    <w:tbl>
-      <w:tblPr>
-        <w:tblW w:type="auto" w:w="0"/>
-        <w:jc w:val="center"/>
-        <w:tblLook w:firstColumn="1" w:firstRow="1" w:lastColumn="0" w:lastRow="0" w:noHBand="0" w:noVBand="1" w:val="04A0"/>
-        <w:tblBorders>
-          <w:top w:val="none" w:sz="0"/>
-          <w:left w:val="none" w:sz="0"/>
-          <w:bottom w:val="none" w:sz="0"/>
-          <w:right w:val="none" w:sz="0"/>
-          <w:insideH w:val="none" w:sz="0"/>
-          <w:insideV w:val="none" w:sz="0"/>
-        </w:tblBorders>
-      </w:tblPr>
-      <w:tblGrid>
-        <w:gridCol w:w="9858"/>
-      </w:tblGrid>
-      <w:tr>
-        <w:tc>
-          <w:tcPr>
-            <w:tcW w:type="dxa" w:w="9858"/>
-            <w:shd w:val="clear" w:fill="EEF6F2"/>
-          </w:tcPr>
-          <w:p>
-            <w:pPr>
-              <w:spacing w:after="60"/>
-            </w:pPr>
-            <w:r>
-              <w:rPr>
-                <w:rFonts w:ascii="Calibri" w:hAnsi="Calibri"/>
-                <w:b/>
-                <w:color w:val="1B4D3E"/>
-                <w:sz w:val="21"/>
-              </w:rPr>
-              <w:t>O da yanlıştı.</w:t>
-            </w:r>
-            <w:r>
-              <w:rPr>
-                <w:rFonts w:ascii="Calibri" w:hAnsi="Calibri"/>
-                <w:b w:val="0"/>
-                <w:color w:val="1B4D3E"/>
-                <w:sz w:val="21"/>
-              </w:rPr>
-              <w:t xml:space="preserve"> Veraart ve ark. (2013) tam bu iki şemayı karşılaştırmış ve ölçülen-sinyalinkini doğruluk açısından "şaşırtıcı" derecede zararlı bulmuştu. Fantomumuz bunu kaçırdı çünkü SNR 30 iyimser bir rejim — meselenin özü ağırlıkların gürültüyle kirlenmesi, dolayısıyla etki ancak yeterli gürültü varken görünür.</w:t>
-            </w:r>
-          </w:p>
-        </w:tc>
-      </w:tr>
-    </w:tbl>
-    <w:tbl>
-      <w:tblPr>
-        <w:tblW w:type="auto" w:w="0"/>
-        <w:jc w:val="center"/>
-        <w:tblLook w:firstColumn="1" w:firstRow="1" w:lastColumn="0" w:lastRow="0" w:noHBand="0" w:noVBand="1" w:val="04A0"/>
-        <w:tblBorders>
-          <w:top w:val="none" w:sz="0"/>
-          <w:left w:val="none" w:sz="0"/>
-          <w:bottom w:val="none" w:sz="0"/>
-          <w:right w:val="none" w:sz="0"/>
-          <w:insideH w:val="none" w:sz="0"/>
-          <w:insideV w:val="none" w:sz="0"/>
-        </w:tblBorders>
-      </w:tblPr>
-      <w:tblGrid>
-        <w:gridCol w:w="9858"/>
-      </w:tblGrid>
-      <w:tr>
-        <w:tc>
-          <w:tcPr>
-            <w:tcW w:type="dxa" w:w="9858"/>
-            <w:shd w:val="clear" w:fill="EEF6F2"/>
-          </w:tcPr>
-          <w:p>
-            <w:pPr>
-              <w:spacing w:after="60"/>
-            </w:pPr>
-            <w:r>
-              <w:rPr>
-                <w:rFonts w:ascii="Calibri" w:hAnsi="Calibri"/>
-                <w:b w:val="0"/>
-                <w:color w:val="1B4D3E"/>
-                <w:sz w:val="21"/>
-              </w:rPr>
-              <w:t>SNR 20 ve 10'da tekrar çalıştırınca Veraart'ın sonucu net şekilde çıktı.</w:t>
-            </w:r>
-          </w:p>
-        </w:tc>
-      </w:tr>
-    </w:tbl>
-    <w:tbl>
-      <w:tblPr>
-        <w:tblW w:type="auto" w:w="0"/>
-        <w:jc w:val="center"/>
-        <w:tblLook w:firstColumn="1" w:firstRow="1" w:lastColumn="0" w:lastRow="0" w:noHBand="0" w:noVBand="1" w:val="04A0"/>
-        <w:tblBorders>
-          <w:top w:val="none" w:sz="0"/>
-          <w:left w:val="none" w:sz="0"/>
-          <w:bottom w:val="none" w:sz="0"/>
-          <w:right w:val="none" w:sz="0"/>
-          <w:insideH w:val="none" w:sz="0"/>
-          <w:insideV w:val="none" w:sz="0"/>
-        </w:tblBorders>
-      </w:tblPr>
-      <w:tblGrid>
-        <w:gridCol w:w="9858"/>
-      </w:tblGrid>
-      <w:tr>
-        <w:tc>
-          <w:tcPr>
-            <w:tcW w:type="dxa" w:w="9858"/>
-            <w:shd w:val="clear" w:fill="EEF6F2"/>
-          </w:tcPr>
-          <w:p>
-            <w:pPr>
-              <w:spacing w:after="60"/>
-            </w:pPr>
-            <w:r>
-              <w:rPr>
-                <w:rFonts w:ascii="Calibri" w:hAnsi="Calibri"/>
-                <w:b w:val="0"/>
-                <w:color w:val="1B4D3E"/>
-                <w:sz w:val="21"/>
-              </w:rPr>
-              <w:t xml:space="preserve">&gt; </w:t>
-            </w:r>
-            <w:r>
-              <w:rPr>
-                <w:rFonts w:ascii="Calibri" w:hAnsi="Calibri"/>
-                <w:b/>
-                <w:color w:val="1B4D3E"/>
-                <w:sz w:val="21"/>
-              </w:rPr>
-              <w:t>★ The lesson to state out loud:</w:t>
-            </w:r>
-            <w:r>
-              <w:rPr>
-                <w:rFonts w:ascii="Calibri" w:hAnsi="Calibri"/>
-                <w:b w:val="0"/>
-                <w:color w:val="1B4D3E"/>
-                <w:sz w:val="21"/>
-              </w:rPr>
-              <w:t xml:space="preserve"> both errors came from the same source — &gt; assuming that two things called by the same name are the same thing. "WLS" in &gt; three manuals meant three different computations. That is the paper's subject, &gt; and we walked into it twice before noticing. &gt; &gt; </w:t>
-            </w:r>
-            <w:r>
-              <w:rPr>
-                <w:rFonts w:ascii="Calibri" w:hAnsi="Calibri"/>
-                <w:b/>
-                <w:color w:val="1B4D3E"/>
-                <w:sz w:val="21"/>
-              </w:rPr>
-              <w:t>★ Yüksek sesle söylenecek ders:</w:t>
-            </w:r>
-            <w:r>
-              <w:rPr>
-                <w:rFonts w:ascii="Calibri" w:hAnsi="Calibri"/>
-                <w:b w:val="0"/>
-                <w:color w:val="1B4D3E"/>
-                <w:sz w:val="21"/>
-              </w:rPr>
-              <w:t xml:space="preserve"> iki hata da aynı kaynaktan geldi — aynı adla &gt; anılan iki şeyin aynı şey olduğunu varsaymak. Üç kılavuzdaki "WLS" üç farklı &gt; hesap demekti. Makalenin konusu bu, ve fark etmeden önce iki kez içine düştük.</w:t>
+              <w:t>Bağımsız bir kod incelemesi buldu.</w:t>
             </w:r>
           </w:p>
         </w:tc>
@@ -2182,7 +1462,7 @@
           <w:color w:val="16213E"/>
           <w:sz w:val="32"/>
         </w:rPr>
-        <w:t>PART 3 — Glossary / Terimler sözlüğü</w:t>
+        <w:t>PART 3 — Terms / Terimler</w:t>
       </w:r>
     </w:p>
     <w:tbl>
@@ -2504,7 +1784,7 @@
                 <w:color w:val="333333"/>
                 <w:sz w:val="20"/>
               </w:rPr>
-              <w:t>Mean diffusivity: average of the three eigenvalues. Must be positive.</w:t>
+              <w:t>Mean diffusivity: the average of the three eigenvalues. Must be positive.</w:t>
             </w:r>
           </w:p>
         </w:tc>
@@ -2683,7 +1963,7 @@
                 <w:color w:val="333333"/>
                 <w:sz w:val="20"/>
               </w:rPr>
-              <w:t>Ağırlıklı en küçük kareler. Ölçümler, genelde sinyale göre ağırlıklandırılır.</w:t>
+              <w:t>Ağırlıklı en küçük kareler. Ölçümler genelde sinyale göre ağırlıklandırılır.</w:t>
             </w:r>
           </w:p>
         </w:tc>
@@ -2735,7 +2015,7 @@
                 <w:color w:val="333333"/>
                 <w:sz w:val="20"/>
               </w:rPr>
-              <w:t>Iteratively reweighted: the fit is repeated, each time reweighting from the previous prediction. MRtrix3's default (2 iterations).</w:t>
+              <w:t>Iteratively reweighted: the fit is repeated, reweighting from the previous prediction. MRtrix3's default, twice.</w:t>
             </w:r>
           </w:p>
         </w:tc>
@@ -2760,7 +2040,7 @@
                 <w:color w:val="333333"/>
                 <w:sz w:val="20"/>
               </w:rPr>
-              <w:t>Yinelemeli yeniden ağırlıklandırma: fit tekrarlanır, her seferinde önceki tahminden yeniden ağırlıklandırılır. MRtrix3 varsayılanı (2 iterasyon).</w:t>
+              <w:t>Yinelemeli yeniden ağırlıklandırma: fit, önceki tahminden yeniden ağırlıklandırılarak tekrarlanır. MRtrix3 varsayılanı, iki kez.</w:t>
             </w:r>
           </w:p>
         </w:tc>
@@ -2812,7 +2092,7 @@
                 <w:color w:val="333333"/>
                 <w:sz w:val="20"/>
               </w:rPr>
-              <w:t>Weights taken from the observed data. Contaminated by noise.</w:t>
+              <w:t>Weights taken from the observed data, so contaminated by noise.</w:t>
             </w:r>
           </w:p>
         </w:tc>
@@ -2837,7 +2117,7 @@
                 <w:color w:val="333333"/>
                 <w:sz w:val="20"/>
               </w:rPr>
-              <w:t>Ağırlıklar gözlenen veriden alınır. Gürültüyle kirlenir.</w:t>
+              <w:t>Ağırlıklar gözlenen veriden alınır, bu yüzden gürültüyle kirlenir.</w:t>
             </w:r>
           </w:p>
         </w:tc>
@@ -2889,7 +2169,7 @@
                 <w:color w:val="333333"/>
                 <w:sz w:val="20"/>
               </w:rPr>
-              <w:t>Weights taken from a model prediction, so less noise-contaminated.</w:t>
+              <w:t>Weights taken from a model prediction, so far less noise-contaminated.</w:t>
             </w:r>
           </w:p>
         </w:tc>
@@ -2914,7 +2194,7 @@
                 <w:color w:val="333333"/>
                 <w:sz w:val="20"/>
               </w:rPr>
-              <w:t>Ağırlıklar model tahmininden alınır, gürültüden daha az etkilenir.</w:t>
+              <w:t>Ağırlıklar model tahmininden alınır, gürültüden çok daha az etkilenir.</w:t>
             </w:r>
           </w:p>
         </w:tc>
@@ -2966,7 +2246,7 @@
                 <w:color w:val="333333"/>
                 <w:sz w:val="20"/>
               </w:rPr>
-              <w:t>Signal-to-noise ratio. Falls as b-value rises.</w:t>
+              <w:t>Signal-to-noise ratio. Falls as the b-value rises.</w:t>
             </w:r>
           </w:p>
         </w:tc>
@@ -3018,7 +2298,7 @@
                 <w:color w:val="333333"/>
                 <w:sz w:val="20"/>
               </w:rPr>
-              <w:t>b-value</w:t>
+              <w:t>Bias / RMSE</w:t>
             </w:r>
           </w:p>
         </w:tc>
@@ -3043,7 +2323,7 @@
                 <w:color w:val="333333"/>
                 <w:sz w:val="20"/>
               </w:rPr>
-              <w:t>Strength of diffusion weighting. Higher b = more diffusion contrast, less signal.</w:t>
+              <w:t>Bias is systematic error; RMSE combines bias and scatter.</w:t>
             </w:r>
           </w:p>
         </w:tc>
@@ -3068,7 +2348,7 @@
                 <w:color w:val="333333"/>
                 <w:sz w:val="20"/>
               </w:rPr>
-              <w:t>Difüzyon ağırlıklandırmasının gücü. Yüksek b = daha çok kontrast, daha az sinyal.</w:t>
+              <w:t>Yanlılık sistematik hata; RMSE yanlılık ve saçılmayı birleştirir.</w:t>
             </w:r>
           </w:p>
         </w:tc>
@@ -3095,7 +2375,7 @@
                 <w:color w:val="333333"/>
                 <w:sz w:val="20"/>
               </w:rPr>
-              <w:t>Shell</w:t>
+              <w:t>Non-physical fit</w:t>
             </w:r>
           </w:p>
         </w:tc>
@@ -3120,7 +2400,7 @@
                 <w:color w:val="333333"/>
                 <w:sz w:val="20"/>
               </w:rPr>
-              <w:t>All volumes at one b-value.</w:t>
+              <w:t>FA above 1 or MD at or below zero, from a negative eigenvalue.</w:t>
             </w:r>
           </w:p>
         </w:tc>
@@ -3145,7 +2425,7 @@
                 <w:color w:val="333333"/>
                 <w:sz w:val="20"/>
               </w:rPr>
-              <w:t>Tek bir b-değerindeki tüm hacimler.</w:t>
+              <w:t>Negatif özdeğerden doğan FA &gt; 1 veya MD ≤ 0 değeri.</w:t>
             </w:r>
           </w:p>
         </w:tc>
@@ -3172,7 +2452,7 @@
                 <w:color w:val="333333"/>
                 <w:sz w:val="20"/>
               </w:rPr>
-              <w:t>Bias / RMSE</w:t>
+              <w:t>Offset</w:t>
             </w:r>
           </w:p>
         </w:tc>
@@ -3197,7 +2477,7 @@
                 <w:color w:val="333333"/>
                 <w:sz w:val="20"/>
               </w:rPr>
-              <w:t>Bias is systematic error; RMSE combines bias and scatter.</w:t>
+              <w:t>The difference between the two weighting schemes on the same data.</w:t>
             </w:r>
           </w:p>
         </w:tc>
@@ -3222,161 +2502,7 @@
                 <w:color w:val="333333"/>
                 <w:sz w:val="20"/>
               </w:rPr>
-              <w:t>Yanlılık sistematik hata; RMSE yanlılık ve saçılmayı birleştirir.</w:t>
-            </w:r>
-          </w:p>
-        </w:tc>
-      </w:tr>
-      <w:tr>
-        <w:tc>
-          <w:tcPr>
-            <w:tcW w:type="dxa" w:w="3286"/>
-          </w:tcPr>
-          <w:p>
-            <w:pPr>
-              <w:spacing w:line="240" w:lineRule="auto" w:before="20" w:after="20"/>
-            </w:pPr>
-            <w:r>
-              <w:rPr>
-                <w:rFonts w:ascii="Times New Roman" w:hAnsi="Times New Roman"/>
-                <w:sz w:val="20"/>
-              </w:rPr>
-            </w:r>
-            <w:r>
-              <w:rPr>
-                <w:rFonts w:ascii="Times New Roman" w:hAnsi="Times New Roman"/>
-                <w:b/>
-                <w:color w:val="333333"/>
-                <w:sz w:val="20"/>
-              </w:rPr>
-              <w:t>Dice (DSC)</w:t>
-            </w:r>
-          </w:p>
-        </w:tc>
-        <w:tc>
-          <w:tcPr>
-            <w:tcW w:type="dxa" w:w="3286"/>
-          </w:tcPr>
-          <w:p>
-            <w:pPr>
-              <w:spacing w:line="240" w:lineRule="auto" w:before="20" w:after="20"/>
-            </w:pPr>
-            <w:r>
-              <w:rPr>
-                <w:rFonts w:ascii="Times New Roman" w:hAnsi="Times New Roman"/>
-                <w:sz w:val="20"/>
-              </w:rPr>
-            </w:r>
-            <w:r>
-              <w:rPr>
-                <w:rFonts w:ascii="Times New Roman" w:hAnsi="Times New Roman"/>
-                <w:b w:val="0"/>
-                <w:color w:val="333333"/>
-                <w:sz w:val="20"/>
-              </w:rPr>
-              <w:t>Overlap between two masks: 0 none, 1 identical.</w:t>
-            </w:r>
-          </w:p>
-        </w:tc>
-        <w:tc>
-          <w:tcPr>
-            <w:tcW w:type="dxa" w:w="3286"/>
-          </w:tcPr>
-          <w:p>
-            <w:pPr>
-              <w:spacing w:line="240" w:lineRule="auto" w:before="20" w:after="20"/>
-            </w:pPr>
-            <w:r>
-              <w:rPr>
-                <w:rFonts w:ascii="Times New Roman" w:hAnsi="Times New Roman"/>
-                <w:sz w:val="20"/>
-              </w:rPr>
-            </w:r>
-            <w:r>
-              <w:rPr>
-                <w:rFonts w:ascii="Times New Roman" w:hAnsi="Times New Roman"/>
-                <w:b w:val="0"/>
-                <w:color w:val="333333"/>
-                <w:sz w:val="20"/>
-              </w:rPr>
-              <w:t>İki maske arasındaki örtüşme: 0 yok, 1 özdeş.</w:t>
-            </w:r>
-          </w:p>
-        </w:tc>
-      </w:tr>
-      <w:tr>
-        <w:tc>
-          <w:tcPr>
-            <w:tcW w:type="dxa" w:w="3286"/>
-          </w:tcPr>
-          <w:p>
-            <w:pPr>
-              <w:spacing w:line="240" w:lineRule="auto" w:before="20" w:after="20"/>
-            </w:pPr>
-            <w:r>
-              <w:rPr>
-                <w:rFonts w:ascii="Times New Roman" w:hAnsi="Times New Roman"/>
-                <w:sz w:val="20"/>
-              </w:rPr>
-            </w:r>
-            <w:r>
-              <w:rPr>
-                <w:rFonts w:ascii="Times New Roman" w:hAnsi="Times New Roman"/>
-                <w:b/>
-                <w:color w:val="333333"/>
-                <w:sz w:val="20"/>
-              </w:rPr>
-              <w:t>Phantom</w:t>
-            </w:r>
-          </w:p>
-        </w:tc>
-        <w:tc>
-          <w:tcPr>
-            <w:tcW w:type="dxa" w:w="3286"/>
-          </w:tcPr>
-          <w:p>
-            <w:pPr>
-              <w:spacing w:line="240" w:lineRule="auto" w:before="20" w:after="20"/>
-            </w:pPr>
-            <w:r>
-              <w:rPr>
-                <w:rFonts w:ascii="Times New Roman" w:hAnsi="Times New Roman"/>
-                <w:sz w:val="20"/>
-              </w:rPr>
-            </w:r>
-            <w:r>
-              <w:rPr>
-                <w:rFonts w:ascii="Times New Roman" w:hAnsi="Times New Roman"/>
-                <w:b w:val="0"/>
-                <w:color w:val="333333"/>
-                <w:sz w:val="20"/>
-              </w:rPr>
-              <w:t>Synthetic data whose true answer is known by construction.</w:t>
-            </w:r>
-          </w:p>
-        </w:tc>
-        <w:tc>
-          <w:tcPr>
-            <w:tcW w:type="dxa" w:w="3286"/>
-          </w:tcPr>
-          <w:p>
-            <w:pPr>
-              <w:spacing w:line="240" w:lineRule="auto" w:before="20" w:after="20"/>
-            </w:pPr>
-            <w:r>
-              <w:rPr>
-                <w:rFonts w:ascii="Times New Roman" w:hAnsi="Times New Roman"/>
-                <w:sz w:val="20"/>
-              </w:rPr>
-            </w:r>
-            <w:r>
-              <w:rPr>
-                <w:rFonts w:ascii="Times New Roman" w:hAnsi="Times New Roman"/>
-                <w:b w:val="0"/>
-                <w:color w:val="333333"/>
-                <w:sz w:val="20"/>
-              </w:rPr>
-              <w:t>Gerçek cevabı yapısı gereği bilinen sentetik veri.</w:t>
+              <w:t>Aynı veride iki ağırlıklandırma şeması arasındaki fark.</w:t>
             </w:r>
           </w:p>
         </w:tc>
@@ -3395,46 +2521,17 @@
         <w:t>PART 4 — Every methodological choice and why / Her metodolojik tercih ve gerekçesi</w:t>
       </w:r>
     </w:p>
-    <w:tbl>
-      <w:tblPr>
-        <w:tblW w:type="auto" w:w="0"/>
-        <w:jc w:val="center"/>
-        <w:tblLook w:firstColumn="1" w:firstRow="1" w:lastColumn="0" w:lastRow="0" w:noHBand="0" w:noVBand="1" w:val="04A0"/>
-        <w:tblBorders>
-          <w:top w:val="none" w:sz="0"/>
-          <w:left w:val="none" w:sz="0"/>
-          <w:bottom w:val="none" w:sz="0"/>
-          <w:right w:val="none" w:sz="0"/>
-          <w:insideH w:val="none" w:sz="0"/>
-          <w:insideV w:val="none" w:sz="0"/>
-        </w:tblBorders>
-      </w:tblPr>
-      <w:tblGrid>
-        <w:gridCol w:w="9858"/>
-      </w:tblGrid>
-      <w:tr>
-        <w:tc>
-          <w:tcPr>
-            <w:tcW w:type="dxa" w:w="9858"/>
-            <w:shd w:val="clear" w:fill="EEF6F2"/>
-          </w:tcPr>
-          <w:p>
-            <w:pPr>
-              <w:spacing w:after="60"/>
-            </w:pPr>
-            <w:r>
-              <w:rPr>
-                <w:rFonts w:ascii="Calibri" w:hAnsi="Calibri"/>
-                <w:b w:val="0"/>
-                <w:color w:val="1B4D3E"/>
-                <w:sz w:val="21"/>
-              </w:rPr>
-              <w:t>Each choice below exists to rule out one alternative explanation. Aşağıdaki her tercih bir alternatif açıklamayı elemek için var.</w:t>
-            </w:r>
-          </w:p>
-        </w:tc>
-      </w:tr>
-    </w:tbl>
+    <w:p>
+      <w:r>
+        <w:rPr>
+          <w:rFonts w:ascii="Calibri" w:hAnsi="Calibri"/>
+          <w:b w:val="0"/>
+          <w:color w:val="333333"/>
+          <w:sz w:val="21"/>
+        </w:rPr>
+        <w:t>Each choice below exists to rule out one alternative explanation.</w:t>
+      </w:r>
+    </w:p>
     <w:tbl>
       <w:tblPr>
         <w:tblStyle w:val="TableGrid"/>
@@ -3517,7 +2614,7 @@
                 <w:color w:val="FFFFFF"/>
                 <w:sz w:val="20"/>
               </w:rPr>
-              <w:t>Rules out / Elediği</w:t>
+              <w:t>Rules out</w:t>
             </w:r>
           </w:p>
         </w:tc>
@@ -3665,7 +2762,7 @@
                 <w:color w:val="333333"/>
                 <w:sz w:val="20"/>
               </w:rPr>
-              <w:t>No preprocessing</w:t>
+              <w:t>No preprocessing in the main analysis</w:t>
             </w:r>
           </w:p>
         </w:tc>
@@ -3717,7 +2814,7 @@
                 <w:color w:val="333333"/>
                 <w:sz w:val="20"/>
               </w:rPr>
-              <w:t>Physical plausibility filter</w:t>
+              <w:t>Physical admissibility filter</w:t>
             </w:r>
           </w:p>
         </w:tc>
@@ -3890,7 +2987,7 @@
                 <w:color w:val="333333"/>
                 <w:sz w:val="20"/>
               </w:rPr>
-              <w:t>Phantom with known truth</w:t>
+              <w:t>Phantoms with known eigenvalues</w:t>
             </w:r>
           </w:p>
         </w:tc>
@@ -3915,7 +3012,7 @@
                 <w:color w:val="333333"/>
                 <w:sz w:val="20"/>
               </w:rPr>
-              <w:t>that one scheme is simply wrong</w:t>
+              <w:t>that no scheme is actually less accurate</w:t>
             </w:r>
           </w:p>
         </w:tc>
@@ -3994,7 +3091,7 @@
                 <w:color w:val="333333"/>
                 <w:sz w:val="20"/>
               </w:rPr>
-              <w:t>Two datasets</w:t>
+              <w:t>Simulations on both real gradient tables</w:t>
             </w:r>
           </w:p>
         </w:tc>
@@ -4019,25 +3116,220 @@
                 <w:color w:val="333333"/>
                 <w:sz w:val="20"/>
               </w:rPr>
+              <w:t>that the result is specific to one protocol</w:t>
+            </w:r>
+          </w:p>
+        </w:tc>
+      </w:tr>
+      <w:tr>
+        <w:tc>
+          <w:tcPr>
+            <w:tcW w:type="dxa" w:w="4929"/>
+          </w:tcPr>
+          <w:p>
+            <w:pPr>
+              <w:spacing w:line="240" w:lineRule="auto" w:before="20" w:after="20"/>
+            </w:pPr>
+            <w:r>
+              <w:rPr>
+                <w:rFonts w:ascii="Times New Roman" w:hAnsi="Times New Roman"/>
+                <w:sz w:val="20"/>
+              </w:rPr>
+            </w:r>
+            <w:r>
+              <w:rPr>
+                <w:rFonts w:ascii="Times New Roman" w:hAnsi="Times New Roman"/>
+                <w:b w:val="0"/>
+                <w:color w:val="333333"/>
+                <w:sz w:val="20"/>
+              </w:rPr>
+              <w:t>Voxels and bins from the DIPY fit alone</w:t>
+            </w:r>
+          </w:p>
+        </w:tc>
+        <w:tc>
+          <w:tcPr>
+            <w:tcW w:type="dxa" w:w="4929"/>
+          </w:tcPr>
+          <w:p>
+            <w:pPr>
+              <w:spacing w:line="240" w:lineRule="auto" w:before="20" w:after="20"/>
+            </w:pPr>
+            <w:r>
+              <w:rPr>
+                <w:rFonts w:ascii="Times New Roman" w:hAnsi="Times New Roman"/>
+                <w:sz w:val="20"/>
+              </w:rPr>
+            </w:r>
+            <w:r>
+              <w:rPr>
+                <w:rFonts w:ascii="Times New Roman" w:hAnsi="Times New Roman"/>
+                <w:b w:val="0"/>
+                <w:color w:val="333333"/>
+                <w:sz w:val="20"/>
+              </w:rPr>
+              <w:t>that the comparison selects on its own outcome</w:t>
+            </w:r>
+          </w:p>
+        </w:tc>
+      </w:tr>
+      <w:tr>
+        <w:tc>
+          <w:tcPr>
+            <w:tcW w:type="dxa" w:w="4929"/>
+          </w:tcPr>
+          <w:p>
+            <w:pPr>
+              <w:spacing w:line="240" w:lineRule="auto" w:before="20" w:after="20"/>
+            </w:pPr>
+            <w:r>
+              <w:rPr>
+                <w:rFonts w:ascii="Times New Roman" w:hAnsi="Times New Roman"/>
+                <w:sz w:val="20"/>
+              </w:rPr>
+            </w:r>
+            <w:r>
+              <w:rPr>
+                <w:rFonts w:ascii="Times New Roman" w:hAnsi="Times New Roman"/>
+                <w:b w:val="0"/>
+                <w:color w:val="333333"/>
+                <w:sz w:val="20"/>
+              </w:rPr>
+              <w:t>Three rules for non-physical fits</w:t>
+            </w:r>
+          </w:p>
+        </w:tc>
+        <w:tc>
+          <w:tcPr>
+            <w:tcW w:type="dxa" w:w="4929"/>
+          </w:tcPr>
+          <w:p>
+            <w:pPr>
+              <w:spacing w:line="240" w:lineRule="auto" w:before="20" w:after="20"/>
+            </w:pPr>
+            <w:r>
+              <w:rPr>
+                <w:rFonts w:ascii="Times New Roman" w:hAnsi="Times New Roman"/>
+                <w:sz w:val="20"/>
+              </w:rPr>
+            </w:r>
+            <w:r>
+              <w:rPr>
+                <w:rFonts w:ascii="Times New Roman" w:hAnsi="Times New Roman"/>
+                <w:b w:val="0"/>
+                <w:color w:val="333333"/>
+                <w:sz w:val="20"/>
+              </w:rPr>
+              <w:t>that one arbitrary rule drives the answer</w:t>
+            </w:r>
+          </w:p>
+        </w:tc>
+      </w:tr>
+      <w:tr>
+        <w:tc>
+          <w:tcPr>
+            <w:tcW w:type="dxa" w:w="4929"/>
+          </w:tcPr>
+          <w:p>
+            <w:pPr>
+              <w:spacing w:line="240" w:lineRule="auto" w:before="20" w:after="20"/>
+            </w:pPr>
+            <w:r>
+              <w:rPr>
+                <w:rFonts w:ascii="Times New Roman" w:hAnsi="Times New Roman"/>
+                <w:sz w:val="20"/>
+              </w:rPr>
+            </w:r>
+            <w:r>
+              <w:rPr>
+                <w:rFonts w:ascii="Times New Roman" w:hAnsi="Times New Roman"/>
+                <w:b w:val="0"/>
+                <w:color w:val="333333"/>
+                <w:sz w:val="20"/>
+              </w:rPr>
+              <w:t>Noise-only controls for every check</w:t>
+            </w:r>
+          </w:p>
+        </w:tc>
+        <w:tc>
+          <w:tcPr>
+            <w:tcW w:type="dxa" w:w="4929"/>
+          </w:tcPr>
+          <w:p>
+            <w:pPr>
+              <w:spacing w:line="240" w:lineRule="auto" w:before="20" w:after="20"/>
+            </w:pPr>
+            <w:r>
+              <w:rPr>
+                <w:rFonts w:ascii="Times New Roman" w:hAnsi="Times New Roman"/>
+                <w:sz w:val="20"/>
+              </w:rPr>
+            </w:r>
+            <w:r>
+              <w:rPr>
+                <w:rFonts w:ascii="Times New Roman" w:hAnsi="Times New Roman"/>
+                <w:b w:val="0"/>
+                <w:color w:val="333333"/>
+                <w:sz w:val="20"/>
+              </w:rPr>
+              <w:t>that an artefact, not noise, produced the pattern</w:t>
+            </w:r>
+          </w:p>
+        </w:tc>
+      </w:tr>
+      <w:tr>
+        <w:tc>
+          <w:tcPr>
+            <w:tcW w:type="dxa" w:w="4929"/>
+          </w:tcPr>
+          <w:p>
+            <w:pPr>
+              <w:spacing w:line="240" w:lineRule="auto" w:before="20" w:after="20"/>
+            </w:pPr>
+            <w:r>
+              <w:rPr>
+                <w:rFonts w:ascii="Times New Roman" w:hAnsi="Times New Roman"/>
+                <w:sz w:val="20"/>
+              </w:rPr>
+            </w:r>
+            <w:r>
+              <w:rPr>
+                <w:rFonts w:ascii="Times New Roman" w:hAnsi="Times New Roman"/>
+                <w:b w:val="0"/>
+                <w:color w:val="333333"/>
+                <w:sz w:val="20"/>
+              </w:rPr>
+              <w:t>Two datasets</w:t>
+            </w:r>
+          </w:p>
+        </w:tc>
+        <w:tc>
+          <w:tcPr>
+            <w:tcW w:type="dxa" w:w="4929"/>
+          </w:tcPr>
+          <w:p>
+            <w:pPr>
+              <w:spacing w:line="240" w:lineRule="auto" w:before="20" w:after="20"/>
+            </w:pPr>
+            <w:r>
+              <w:rPr>
+                <w:rFonts w:ascii="Times New Roman" w:hAnsi="Times New Roman"/>
+                <w:sz w:val="20"/>
+              </w:rPr>
+            </w:r>
+            <w:r>
+              <w:rPr>
+                <w:rFonts w:ascii="Times New Roman" w:hAnsi="Times New Roman"/>
+                <w:b w:val="0"/>
+                <w:color w:val="333333"/>
+                <w:sz w:val="20"/>
+              </w:rPr>
               <w:t>that it is a one-off artefact</w:t>
             </w:r>
           </w:p>
         </w:tc>
       </w:tr>
     </w:tbl>
-    <w:p>
-      <w:pPr>
-        <w:spacing w:before="160"/>
-      </w:pPr>
-      <w:r>
-        <w:rPr>
-          <w:b/>
-          <w:color w:val="0F4C81"/>
-          <w:sz w:val="25"/>
-        </w:rPr>
-        <w:t>The choice most likely to be challenged / En çok itiraz görecek tercih</w:t>
-      </w:r>
-    </w:p>
     <w:p>
       <w:r>
         <w:rPr>
@@ -4046,7 +3338,7 @@
           <w:color w:val="333333"/>
           <w:sz w:val="21"/>
         </w:rPr>
-        <w:t>EN — Why no preprocessing?</w:t>
+        <w:t>The choice most likely to be challenged: why no preprocessing?</w:t>
       </w:r>
       <w:r>
         <w:rPr>
@@ -4055,25 +3347,7 @@
           <w:color w:val="333333"/>
           <w:sz w:val="21"/>
         </w:rPr>
-        <w:t xml:space="preserve"> Because any preprocessing step is itself a toolkit-specific choice. But note the asymmetry we </w:t>
-      </w:r>
-      <w:r>
-        <w:rPr>
-          <w:rFonts w:ascii="Calibri" w:hAnsi="Calibri"/>
-          <w:i/>
-          <w:color w:val="333333"/>
-          <w:sz w:val="21"/>
-        </w:rPr>
-        <w:t>cannot</w:t>
-      </w:r>
-      <w:r>
-        <w:rPr>
-          <w:rFonts w:ascii="Calibri" w:hAnsi="Calibri"/>
-          <w:b w:val="0"/>
-          <w:color w:val="333333"/>
-          <w:sz w:val="21"/>
-        </w:rPr>
-        <w:t xml:space="preserve"> avoid: FSL has no denoiser. Giving each toolkit "its own" preprocessing would leave FSL fitting noisier data, and the difference would no longer be attributable to the fit. So preprocessing is either absent (main analysis) or identical for all three (sensitivity analysis). Both are reported.</w:t>
+        <w:t xml:space="preserve"> Because any preprocessing step is itself a toolkit-specific choice. Note the asymmetry we cannot escape: FSL ships no denoiser, so giving each toolkit "its own" preprocessing would leave FSL fitting noisier data and the difference would no longer be attributable to the fit. So preprocessing is either absent (main analysis) or identical for all three (sensitivity analysis). Both are reported.</w:t>
       </w:r>
     </w:p>
     <w:tbl>
@@ -4106,11 +3380,51 @@
             <w:r>
               <w:rPr>
                 <w:rFonts w:ascii="Calibri" w:hAnsi="Calibri"/>
+                <w:b w:val="0"/>
+                <w:color w:val="1B4D3E"/>
+                <w:sz w:val="21"/>
+              </w:rPr>
+              <w:t>Aşağıdaki her tercih bir alternatif açıklamayı elemek için var: ortak maske (maskeleme değil), ortak hacim alt kümesi (kabuk seçimi değil), ön işleme yok (bir aracın ön işlemesi sızmasın), fiziksel kabul edilebilirlik filtresi (bozuk fitler korelasyonu belirlemesin), eşleşmiş estimator (fark algoritmadan mı araçtan mı), DIPY'ye ölçülen-sinyal ağırlığı vermek (sebep ağırlıklandırma mı), bilinen özdeğerli fantomlar (hangi şema daha az doğru), üç SNR seviyesi (etki yalnızca iyi veride mi), iki protokolün simülasyonu (sonuç tek protokole mi özgü), voksel ve binlerin yalnızca DIPY fit'inden alınması (karşılaştırma kendi sonucuna göre seçim yapmasın), fiziksel olmayan fitler için üç kural (cevabı keyfi bir kural mı belirliyor), her kontrol için salt gürültü karşılaştırması (deseni gürültü mü yoksa bir artefakt mı üretti), iki veri seti (tek seferlik bir yapaylık mı).</w:t>
+            </w:r>
+          </w:p>
+        </w:tc>
+      </w:tr>
+    </w:tbl>
+    <w:tbl>
+      <w:tblPr>
+        <w:tblW w:type="auto" w:w="0"/>
+        <w:jc w:val="center"/>
+        <w:tblLook w:firstColumn="1" w:firstRow="1" w:lastColumn="0" w:lastRow="0" w:noHBand="0" w:noVBand="1" w:val="04A0"/>
+        <w:tblBorders>
+          <w:top w:val="none" w:sz="0"/>
+          <w:left w:val="none" w:sz="0"/>
+          <w:bottom w:val="none" w:sz="0"/>
+          <w:right w:val="none" w:sz="0"/>
+          <w:insideH w:val="none" w:sz="0"/>
+          <w:insideV w:val="none" w:sz="0"/>
+        </w:tblBorders>
+      </w:tblPr>
+      <w:tblGrid>
+        <w:gridCol w:w="9858"/>
+      </w:tblGrid>
+      <w:tr>
+        <w:tc>
+          <w:tcPr>
+            <w:tcW w:type="dxa" w:w="9858"/>
+            <w:shd w:val="clear" w:fill="EEF6F2"/>
+          </w:tcPr>
+          <w:p>
+            <w:pPr>
+              <w:spacing w:after="60"/>
+            </w:pPr>
+            <w:r>
+              <w:rPr>
+                <w:rFonts w:ascii="Calibri" w:hAnsi="Calibri"/>
                 <w:b/>
                 <w:color w:val="1B4D3E"/>
                 <w:sz w:val="21"/>
               </w:rPr>
-              <w:t>TR — Neden ön işleme yok?</w:t>
+              <w:t>En çok itiraz görecek tercih: neden ön işleme yok?</w:t>
             </w:r>
             <w:r>
               <w:rPr>
@@ -4119,7 +3433,7 @@
                 <w:color w:val="1B4D3E"/>
                 <w:sz w:val="21"/>
               </w:rPr>
-              <w:t xml:space="preserve"> Çünkü her ön işleme adımı kendisi araca özgü bir tercih. Ama kaçınamadığımız asimetriye dikkat: FSL'de gürültü giderici yok. Her araca "kendi" ön işlemesini vermek FSL'i gürültülü veriyle bırakırdı ve fark artık uydurmaya atfedilemezdi. Bu yüzden ön işleme ya yok (ana analiz) ya da üçü için aynı (duyarlılık analizi). İkisi de raporlanıyor.</w:t>
+              <w:t xml:space="preserve"> Çünkü her ön işleme adımı kendisi araca özgü bir tercih. Kaçınamadığımız asimetriye dikkat: FSL'de gürültü giderici yok; her araca "kendi" ön işlemesini vermek FSL'i gürültülü veriyle bırakırdı ve fark artık uydurmaya atfedilemezdi. Bu yüzden ön işleme ya yok (ana analiz) ya da üçü için aynı (duyarlılık analizi). İkisi de raporlanıyor.</w:t>
             </w:r>
           </w:p>
         </w:tc>
@@ -4281,7 +3595,7 @@
                 <w:color w:val="333333"/>
                 <w:sz w:val="20"/>
               </w:rPr>
-              <w:t xml:space="preserve"> FSL = MRtrix3 at matched estimator: r = 1.0000, MAE 0.0000</w:t>
+              <w:t xml:space="preserve"> FSL = MRtrix3 at a matched estimator: r = 1.0000, MAE below 0.0001</w:t>
             </w:r>
           </w:p>
         </w:tc>
@@ -4385,7 +3699,7 @@
                 <w:color w:val="333333"/>
                 <w:sz w:val="20"/>
               </w:rPr>
-              <w:t>Predicted-signal weights. Give it measured-signal weights → 98% of the gap closes</w:t>
+              <w:t>Predicted-signal weights. Give it measured-signal weights and 98% of the gap closes</w:t>
             </w:r>
           </w:p>
         </w:tc>
@@ -4412,7 +3726,7 @@
                 <w:color w:val="333333"/>
                 <w:sz w:val="20"/>
               </w:rPr>
-              <w:t>Is one scheme wrong?</w:t>
+              <w:t>Is one scheme less accurate?</w:t>
             </w:r>
           </w:p>
         </w:tc>
@@ -4437,7 +3751,7 @@
                 <w:color w:val="333333"/>
                 <w:sz w:val="20"/>
               </w:rPr>
-              <w:t>Yes — measured-signal is less accurate (Veraart 2013), confirmed here</w:t>
+              <w:t>Yes, in MD: measured-signal weighting, as Veraart (2013) reported</w:t>
             </w:r>
           </w:p>
         </w:tc>
@@ -4489,7 +3803,7 @@
                 <w:color w:val="333333"/>
                 <w:sz w:val="20"/>
               </w:rPr>
-              <w:t>At SNR 30 no; at SNR 10 the MD bias is ~2.4× larger</w:t>
+              <w:t>At SNR 30 the MD bias is −0.0065 µm²/ms; at SNR 10 it is −0.0542</w:t>
             </w:r>
           </w:p>
         </w:tc>
@@ -4516,7 +3830,7 @@
                 <w:color w:val="333333"/>
                 <w:sz w:val="20"/>
               </w:rPr>
-              <w:t>How big on real data?</w:t>
+              <w:t>Does the FA result hold everywhere?</w:t>
             </w:r>
           </w:p>
         </w:tc>
@@ -4541,7 +3855,7 @@
                 <w:color w:val="333333"/>
                 <w:sz w:val="20"/>
               </w:rPr>
-              <w:t>0.12–0.26 SD of white matter FA</w:t>
+              <w:t>No. On the phantom and the Stanford protocol yes; on the Sherbrooke protocol its FA bias was the largest in only 8 of 30 conditions</w:t>
             </w:r>
           </w:p>
         </w:tc>
@@ -4568,7 +3882,7 @@
                 <w:color w:val="333333"/>
                 <w:sz w:val="20"/>
               </w:rPr>
-              <w:t>Bigger than switching toolkit?</w:t>
+              <w:t>How big on real data?</w:t>
             </w:r>
           </w:p>
         </w:tc>
@@ -4589,20 +3903,11 @@
             <w:r>
               <w:rPr>
                 <w:rFonts w:ascii="Times New Roman" w:hAnsi="Times New Roman"/>
-                <w:b/>
-                <w:color w:val="333333"/>
-                <w:sz w:val="20"/>
-              </w:rPr>
-              <w:t>Yes</w:t>
-            </w:r>
-            <w:r>
-              <w:rPr>
-                <w:rFonts w:ascii="Times New Roman" w:hAnsi="Times New Roman"/>
                 <w:b w:val="0"/>
                 <w:color w:val="333333"/>
                 <w:sz w:val="20"/>
               </w:rPr>
-              <w:t xml:space="preserve"> — one FSL flag beats replacing FSL entirely</w:t>
+              <w:t>Differences of 0.09–0.25 SD of white matter FA</w:t>
             </w:r>
           </w:p>
         </w:tc>
@@ -4629,7 +3934,7 @@
                 <w:color w:val="333333"/>
                 <w:sz w:val="20"/>
               </w:rPr>
-              <w:t>Does denoising fix it?</w:t>
+              <w:t>Bigger than switching toolkit?</w:t>
             </w:r>
           </w:p>
         </w:tc>
@@ -4650,11 +3955,20 @@
             <w:r>
               <w:rPr>
                 <w:rFonts w:ascii="Times New Roman" w:hAnsi="Times New Roman"/>
+                <w:b/>
+                <w:color w:val="333333"/>
+                <w:sz w:val="20"/>
+              </w:rPr>
+              <w:t>Yes</w:t>
+            </w:r>
+            <w:r>
+              <w:rPr>
+                <w:rFonts w:ascii="Times New Roman" w:hAnsi="Times New Roman"/>
                 <w:b w:val="0"/>
                 <w:color w:val="333333"/>
                 <w:sz w:val="20"/>
               </w:rPr>
-              <w:t>Reduces by ~half, does not close</w:t>
+              <w:t xml:space="preserve"> — one FSL flag beats replacing FSL entirely at a matched estimator</w:t>
             </w:r>
           </w:p>
         </w:tc>
@@ -4681,7 +3995,7 @@
                 <w:color w:val="333333"/>
                 <w:sz w:val="20"/>
               </w:rPr>
-              <w:t>Non-physical fits?</w:t>
+              <w:t>Do the real-data differences come from noise?</w:t>
             </w:r>
           </w:p>
         </w:tc>
@@ -4706,7 +4020,163 @@
                 <w:color w:val="333333"/>
                 <w:sz w:val="20"/>
               </w:rPr>
-              <w:t>DIPY never produced one; FSL and MRtrix3 did, at rates depending on SNR</w:t>
+              <w:t>Mostly. At the measured noise level, noise on each voxel's own tensor reproduces 101% of the Stanford FA offset, 83% of its MD offset, and 89–106% and 86–91% on Sherbrooke</w:t>
+            </w:r>
+          </w:p>
+        </w:tc>
+      </w:tr>
+      <w:tr>
+        <w:tc>
+          <w:tcPr>
+            <w:tcW w:type="dxa" w:w="4929"/>
+          </w:tcPr>
+          <w:p>
+            <w:pPr>
+              <w:spacing w:line="240" w:lineRule="auto" w:before="20" w:after="20"/>
+            </w:pPr>
+            <w:r>
+              <w:rPr>
+                <w:rFonts w:ascii="Times New Roman" w:hAnsi="Times New Roman"/>
+                <w:sz w:val="20"/>
+              </w:rPr>
+            </w:r>
+            <w:r>
+              <w:rPr>
+                <w:rFonts w:ascii="Times New Roman" w:hAnsi="Times New Roman"/>
+                <w:b w:val="0"/>
+                <w:color w:val="333333"/>
+                <w:sz w:val="20"/>
+              </w:rPr>
+              <w:t>What is left unexplained?</w:t>
+            </w:r>
+          </w:p>
+        </w:tc>
+        <w:tc>
+          <w:tcPr>
+            <w:tcW w:type="dxa" w:w="4929"/>
+          </w:tcPr>
+          <w:p>
+            <w:pPr>
+              <w:spacing w:line="240" w:lineRule="auto" w:before="20" w:after="20"/>
+            </w:pPr>
+            <w:r>
+              <w:rPr>
+                <w:rFonts w:ascii="Times New Roman" w:hAnsi="Times New Roman"/>
+                <w:sz w:val="20"/>
+              </w:rPr>
+            </w:r>
+            <w:r>
+              <w:rPr>
+                <w:rFonts w:ascii="Times New Roman" w:hAnsi="Times New Roman"/>
+                <w:b w:val="0"/>
+                <w:color w:val="333333"/>
+                <w:sz w:val="20"/>
+              </w:rPr>
+              <w:t>13–17% of the MD offsets, and Stanford's most anisotropic bin</w:t>
+            </w:r>
+          </w:p>
+        </w:tc>
+      </w:tr>
+      <w:tr>
+        <w:tc>
+          <w:tcPr>
+            <w:tcW w:type="dxa" w:w="4929"/>
+          </w:tcPr>
+          <w:p>
+            <w:pPr>
+              <w:spacing w:line="240" w:lineRule="auto" w:before="20" w:after="20"/>
+            </w:pPr>
+            <w:r>
+              <w:rPr>
+                <w:rFonts w:ascii="Times New Roman" w:hAnsi="Times New Roman"/>
+                <w:sz w:val="20"/>
+              </w:rPr>
+            </w:r>
+            <w:r>
+              <w:rPr>
+                <w:rFonts w:ascii="Times New Roman" w:hAnsi="Times New Roman"/>
+                <w:b w:val="0"/>
+                <w:color w:val="333333"/>
+                <w:sz w:val="20"/>
+              </w:rPr>
+              <w:t>Does denoising fix it?</w:t>
+            </w:r>
+          </w:p>
+        </w:tc>
+        <w:tc>
+          <w:tcPr>
+            <w:tcW w:type="dxa" w:w="4929"/>
+          </w:tcPr>
+          <w:p>
+            <w:pPr>
+              <w:spacing w:line="240" w:lineRule="auto" w:before="20" w:after="20"/>
+            </w:pPr>
+            <w:r>
+              <w:rPr>
+                <w:rFonts w:ascii="Times New Roman" w:hAnsi="Times New Roman"/>
+                <w:sz w:val="20"/>
+              </w:rPr>
+            </w:r>
+            <w:r>
+              <w:rPr>
+                <w:rFonts w:ascii="Times New Roman" w:hAnsi="Times New Roman"/>
+                <w:b w:val="0"/>
+                <w:color w:val="333333"/>
+                <w:sz w:val="20"/>
+              </w:rPr>
+              <w:t>It halves the MD offset (44–61%) but does not close it</w:t>
+            </w:r>
+          </w:p>
+        </w:tc>
+      </w:tr>
+      <w:tr>
+        <w:tc>
+          <w:tcPr>
+            <w:tcW w:type="dxa" w:w="4929"/>
+          </w:tcPr>
+          <w:p>
+            <w:pPr>
+              <w:spacing w:line="240" w:lineRule="auto" w:before="20" w:after="20"/>
+            </w:pPr>
+            <w:r>
+              <w:rPr>
+                <w:rFonts w:ascii="Times New Roman" w:hAnsi="Times New Roman"/>
+                <w:sz w:val="20"/>
+              </w:rPr>
+            </w:r>
+            <w:r>
+              <w:rPr>
+                <w:rFonts w:ascii="Times New Roman" w:hAnsi="Times New Roman"/>
+                <w:b w:val="0"/>
+                <w:color w:val="333333"/>
+                <w:sz w:val="20"/>
+              </w:rPr>
+              <w:t>Non-physical fits?</w:t>
+            </w:r>
+          </w:p>
+        </w:tc>
+        <w:tc>
+          <w:tcPr>
+            <w:tcW w:type="dxa" w:w="4929"/>
+          </w:tcPr>
+          <w:p>
+            <w:pPr>
+              <w:spacing w:line="240" w:lineRule="auto" w:before="20" w:after="20"/>
+            </w:pPr>
+            <w:r>
+              <w:rPr>
+                <w:rFonts w:ascii="Times New Roman" w:hAnsi="Times New Roman"/>
+                <w:sz w:val="20"/>
+              </w:rPr>
+            </w:r>
+            <w:r>
+              <w:rPr>
+                <w:rFonts w:ascii="Times New Roman" w:hAnsi="Times New Roman"/>
+                <w:b w:val="0"/>
+                <w:color w:val="333333"/>
+                <w:sz w:val="20"/>
+              </w:rPr>
+              <w:t>DIPY returns none because it clips eigenvalues; FSL and MRtrix3 return them in 0.14–3.97% of white matter voxels</w:t>
             </w:r>
           </w:p>
         </w:tc>
@@ -4742,7 +4212,7 @@
           <w:color w:val="333333"/>
           <w:sz w:val="21"/>
         </w:rPr>
-        <w:t xml:space="preserve"> Left: brain extraction, each tool on its own idiomatic input, giving Dice. Right: tensor fitting, everything held identical and the estimator varied deliberately. Arms labelled by weight source. </w:t>
+        <w:t xml:space="preserve"> Left: brain extraction, each tool on its own idiomatic input. Right: tensor fitting, everything held identical and the estimator varied deliberately, with arms labelled by weight source. </w:t>
       </w:r>
       <w:r>
         <w:rPr>
@@ -4763,46 +4233,6 @@
         <w:t xml:space="preserve"> the two branches make opposite choices about the input, on purpose.</w:t>
       </w:r>
     </w:p>
-    <w:tbl>
-      <w:tblPr>
-        <w:tblW w:type="auto" w:w="0"/>
-        <w:jc w:val="center"/>
-        <w:tblLook w:firstColumn="1" w:firstRow="1" w:lastColumn="0" w:lastRow="0" w:noHBand="0" w:noVBand="1" w:val="04A0"/>
-        <w:tblBorders>
-          <w:top w:val="none" w:sz="0"/>
-          <w:left w:val="none" w:sz="0"/>
-          <w:bottom w:val="none" w:sz="0"/>
-          <w:right w:val="none" w:sz="0"/>
-          <w:insideH w:val="none" w:sz="0"/>
-          <w:insideV w:val="none" w:sz="0"/>
-        </w:tblBorders>
-      </w:tblPr>
-      <w:tblGrid>
-        <w:gridCol w:w="9858"/>
-      </w:tblGrid>
-      <w:tr>
-        <w:tc>
-          <w:tcPr>
-            <w:tcW w:type="dxa" w:w="9858"/>
-            <w:shd w:val="clear" w:fill="EEF6F2"/>
-          </w:tcPr>
-          <w:p>
-            <w:pPr>
-              <w:spacing w:after="60"/>
-            </w:pPr>
-            <w:r>
-              <w:rPr>
-                <w:rFonts w:ascii="Calibri" w:hAnsi="Calibri"/>
-                <w:i/>
-                <w:color w:val="1B4D3E"/>
-                <w:sz w:val="21"/>
-              </w:rPr>
-              <w:t>Sol: beyin çıkarımı, her araç kendi girdisiyle, Dice veriyor. Sağ: tensör uydurma, her şey sabit, estimator kasıtlı değiştiriliyor. Kollar ağırlık kaynağıyla etiketli. Amaç: iki kol girdi konusunda bilerek zıt tercihler yapıyor.</w:t>
-            </w:r>
-          </w:p>
-        </w:tc>
-      </w:tr>
-    </w:tbl>
     <w:p>
       <w:r>
         <w:rPr>
@@ -4811,7 +4241,27 @@
           <w:color w:val="333333"/>
           <w:sz w:val="21"/>
         </w:rPr>
-        <w:t>Figure 2 — Interface.</w:t>
+        <w:t>Figure 2 — Agreement with the estimator matched.</w:t>
+      </w:r>
+      <w:r>
+        <w:rPr>
+          <w:rFonts w:ascii="Calibri" w:hAnsi="Calibri"/>
+          <w:b w:val="0"/>
+          <w:color w:val="333333"/>
+          <w:sz w:val="21"/>
+        </w:rPr>
+        <w:t xml:space="preserve"> FA maps, pairwise scatter and Bland–Altman, with each panel labelled by the command it ran. FSL and MRtrix3 coincide; both differ from DIPY by the same amount. The FSL–MRtrix3 panel names the 57 voxels that fall outside its axis, all of them voxels containing a measurement at or below zero.</w:t>
+      </w:r>
+    </w:p>
+    <w:p>
+      <w:r>
+        <w:rPr>
+          <w:rFonts w:ascii="Calibri" w:hAnsi="Calibri"/>
+          <w:b/>
+          <w:color w:val="333333"/>
+          <w:sz w:val="21"/>
+        </w:rPr>
+        <w:t>Supplementary Figure S1 — Interface.</w:t>
       </w:r>
       <w:r>
         <w:rPr>
@@ -4838,7 +4288,7 @@
           <w:color w:val="333333"/>
           <w:sz w:val="21"/>
         </w:rPr>
-        <w:t xml:space="preserve"> the command is shown in full and runs unchanged outside the tool — an instrument, not a black box.</w:t>
+        <w:t xml:space="preserve"> the command is shown in full and runs unchanged outside the tool.</w:t>
       </w:r>
     </w:p>
     <w:p>
@@ -4849,7 +4299,7 @@
           <w:color w:val="333333"/>
           <w:sz w:val="21"/>
         </w:rPr>
-        <w:t>Figure 3 — Agreement at defaults.</w:t>
+        <w:t>Supplementary Figures S2–S3 — Brain masks.</w:t>
       </w:r>
       <w:r>
         <w:rPr>
@@ -4858,7 +4308,7 @@
           <w:color w:val="333333"/>
           <w:sz w:val="21"/>
         </w:rPr>
-        <w:t xml:space="preserve"> (a) FA maps look the same. (b) scatter: MRtrix3–DIPY a thin line, FSL pairs fat clouds. (c) Bland–Altman: FSL pairs offset from zero. </w:t>
+        <w:t xml:space="preserve"> FSL widest, MRtrix3 narrowest, DIPY excluding the ventricles. </w:t>
       </w:r>
       <w:r>
         <w:rPr>
@@ -4876,7 +4326,7 @@
           <w:color w:val="333333"/>
           <w:sz w:val="21"/>
         </w:rPr>
-        <w:t xml:space="preserve"> panel (a) says they agree, (b)–(c) say not quite — and Table 3 shows this follows the estimator, not the toolkit.</w:t>
+        <w:t xml:space="preserve"> Dice stays above 0.90 despite a 21% spread in mask volume, and the ordering flips between datasets.</w:t>
       </w:r>
     </w:p>
     <w:p>
@@ -4887,7 +4337,7 @@
           <w:color w:val="333333"/>
           <w:sz w:val="21"/>
         </w:rPr>
-        <w:t>Figure 4 — Brain masks.</w:t>
+        <w:t>Supplementary Figure S4 — Sherbrooke agreement.</w:t>
       </w:r>
       <w:r>
         <w:rPr>
@@ -4896,25 +4346,7 @@
           <w:color w:val="333333"/>
           <w:sz w:val="21"/>
         </w:rPr>
-        <w:t xml:space="preserve"> FSL widest, MRtrix3 narrowest, DIPY excludes ventricles. </w:t>
-      </w:r>
-      <w:r>
-        <w:rPr>
-          <w:rFonts w:ascii="Calibri" w:hAnsi="Calibri"/>
-          <w:i/>
-          <w:color w:val="333333"/>
-          <w:sz w:val="21"/>
-        </w:rPr>
-        <w:t>Point:</w:t>
-      </w:r>
-      <w:r>
-        <w:rPr>
-          <w:rFonts w:ascii="Calibri" w:hAnsi="Calibri"/>
-          <w:b w:val="0"/>
-          <w:color w:val="333333"/>
-          <w:sz w:val="21"/>
-        </w:rPr>
-        <w:t xml:space="preserve"> Dice stays above 0.90 despite a 21% volume spread, and the ordering flips between datasets.</w:t>
+        <w:t xml:space="preserve"> As Figure 2, for the second dataset.</w:t>
       </w:r>
     </w:p>
     <w:p>
@@ -4947,7 +4379,7 @@
           <w:color w:val="333333"/>
           <w:sz w:val="21"/>
         </w:rPr>
-        <w:t xml:space="preserve"> Every component is documented. MRtrix3 says it iterates; DIPY cites Chung 2006; FSL's flag is in its help text. Veraart et al. (2013) established which scheme is more accurate.</w:t>
+        <w:t xml:space="preserve"> Every component is documented. MRtrix3 says it iterates; DIPY cites Chung et al. (2006); FSL's flag is in its help text. Veraart et al. (2013) established which scheme is more accurate.</w:t>
       </w:r>
     </w:p>
     <w:p>
@@ -4980,11 +4412,6 @@
         </w:rPr>
         <w:t>Why that is worth publishing:</w:t>
       </w:r>
-    </w:p>
-    <w:p>
-      <w:pPr>
-        <w:ind w:left="340"/>
-      </w:pPr>
       <w:r>
         <w:rPr>
           <w:rFonts w:ascii="Calibri" w:hAnsi="Calibri"/>
@@ -4992,7 +4419,7 @@
           <w:color w:val="333333"/>
           <w:sz w:val="21"/>
         </w:rPr>
-        <w:t>1. Nobody has measured it. The magnitudes and the ordering are new. 2. It is directly actionable: report the estimator, not just the toolkit. 3. It reframes "software variability" — a phrase in wide use — as something more specific and fixable. 4. It is fully reproducible: open data, open code, one DOI, four commands.</w:t>
+        <w:t xml:space="preserve"> nobody had measured it; it is directly actionable (report the estimator, not just the toolkit); it reframes "software variability" as something specific and fixable; and it is fully reproducible from open data with no credentials.</w:t>
       </w:r>
     </w:p>
     <w:p>
@@ -5067,7 +4494,7 @@
                 <w:color w:val="1B4D3E"/>
                 <w:sz w:val="21"/>
               </w:rPr>
-              <w:t xml:space="preserve"> Her bileşen belgelenmiş. MRtrix3 iterasyon yaptığını söylüyor; DIPY Chung 2006'ya atıf veriyor; FSL'in bayrağı yardım metninde. Veraart ve ark. (2013) hangi şemanın daha doğru olduğunu göstermişti.</w:t>
+              <w:t xml:space="preserve"> Her bileşen belgelenmiş. MRtrix3 iterasyon yaptığını söylüyor; DIPY Chung ve ark. 2006'ya atıf veriyor; FSL'in bayrağı yardım metninde. Veraart ve ark. (2013) hangi şemanın daha doğru olduğunu göstermişti.</w:t>
             </w:r>
           </w:p>
         </w:tc>
@@ -5158,37 +4585,6 @@
               </w:rPr>
               <w:t>Neden yayımlanmaya değer:</w:t>
             </w:r>
-          </w:p>
-        </w:tc>
-      </w:tr>
-    </w:tbl>
-    <w:tbl>
-      <w:tblPr>
-        <w:tblW w:type="auto" w:w="0"/>
-        <w:jc w:val="center"/>
-        <w:tblLook w:firstColumn="1" w:firstRow="1" w:lastColumn="0" w:lastRow="0" w:noHBand="0" w:noVBand="1" w:val="04A0"/>
-        <w:tblBorders>
-          <w:top w:val="none" w:sz="0"/>
-          <w:left w:val="none" w:sz="0"/>
-          <w:bottom w:val="none" w:sz="0"/>
-          <w:right w:val="none" w:sz="0"/>
-          <w:insideH w:val="none" w:sz="0"/>
-          <w:insideV w:val="none" w:sz="0"/>
-        </w:tblBorders>
-      </w:tblPr>
-      <w:tblGrid>
-        <w:gridCol w:w="9858"/>
-      </w:tblGrid>
-      <w:tr>
-        <w:tc>
-          <w:tcPr>
-            <w:tcW w:type="dxa" w:w="9858"/>
-            <w:shd w:val="clear" w:fill="EEF6F2"/>
-          </w:tcPr>
-          <w:p>
-            <w:pPr>
-              <w:spacing w:after="60"/>
-            </w:pPr>
             <w:r>
               <w:rPr>
                 <w:rFonts w:ascii="Calibri" w:hAnsi="Calibri"/>
@@ -5196,7 +4592,7 @@
                 <w:color w:val="1B4D3E"/>
                 <w:sz w:val="21"/>
               </w:rPr>
-              <w:t>1. Kimse ölçmemiş. Büyüklükler ve sıralama yeni. 2. Doğrudan eyleme dönüşür: aracı değil estimator'ü raporla. 3. Yaygın kullanılan "yazılım değişkenliği" ifadesini daha belirli ve düzeltilebilir bir şeye dönüştürüyor. 4. Tamamen tekrarlanabilir: açık veri, açık kod, tek DOI, dört komut.</w:t>
+              <w:t xml:space="preserve"> kimse ölçmemiş; doğrudan eyleme dönüşür (aracı değil estimator'ü raporla); yaygın "yazılım değişkenliği" ifadesini daha belirli ve düzeltilebilir bir şeye çeviriyor; ve kimlik bilgisi gerektirmeyen açık veriyle tamamen tekrarlanabilir.</w:t>
             </w:r>
           </w:p>
         </w:tc>
@@ -5334,7 +4730,7 @@
                 <w:color w:val="1B4D3E"/>
                 <w:sz w:val="21"/>
               </w:rPr>
-              <w:t xml:space="preserve"> Yes — it is the paper's starting point, cited in the abstract, introduction and discussion. We reproduce its result for the specific configurations these toolkits ship, and show the recommendation has not reached the defaults. </w:t>
+              <w:t xml:space="preserve"> Yes — it is the paper's starting point, cited in the abstract, introduction and discussion. We reproduce its result for the configurations these toolkits distribute, add the SNR dependence the mechanism predicts, and show the recommendation has not reached the defaults. </w:t>
             </w:r>
             <w:r>
               <w:rPr>
@@ -5352,7 +4748,7 @@
                 <w:color w:val="1B4D3E"/>
                 <w:sz w:val="21"/>
               </w:rPr>
-              <w:t xml:space="preserve"> Evet — makalenin başlangıç noktası, abstract, introduction ve discussion'da atıflı. Sonucunu bu araçların dağıttığı yapılandırmalar için tekrarlıyor ve tavsiyenin varsayılanlara ulaşmadığını gösteriyoruz.</w:t>
+              <w:t xml:space="preserve"> Evet — makalenin başlangıç noktası. Sonucunu bu araçların dağıttığı yapılandırmalar için tekrarlıyor, mekanizmanın öngördüğü SNR bağımlılığını ekliyor ve tavsiyenin varsayılanlara ulaşmadığını gösteriyoruz.</w:t>
             </w:r>
           </w:p>
         </w:tc>
@@ -5392,7 +4788,7 @@
                 <w:color w:val="1B4D3E"/>
                 <w:sz w:val="21"/>
               </w:rPr>
-              <w:t>Q: Your reference arm is the scheme the literature discourages. Deliberate?</w:t>
+              <w:t>Q: Is measured-signal weighting always the worst scheme?</w:t>
             </w:r>
             <w:r>
               <w:rPr>
@@ -5419,7 +4815,7 @@
                 <w:color w:val="1B4D3E"/>
                 <w:sz w:val="21"/>
               </w:rPr>
-              <w:t xml:space="preserve"> Yes. It is the arm two toolkits reach when asked for "weighted least squares", so it is the one users will most often believe they are getting. We state in the discussion that it is the less accurate of the two. </w:t>
+              <w:t xml:space="preserve"> In MD, in every condition we simulated, yes. In FA it depends on the protocol: on a single-b = 0, b = 1000 acquisition its negative FA bias partly cancels the upward bias that noise causes in every estimator, so its absolute FA bias can be smaller. The paper says this explicitly. </w:t>
             </w:r>
             <w:r>
               <w:rPr>
@@ -5437,7 +4833,7 @@
                 <w:color w:val="1B4D3E"/>
                 <w:sz w:val="21"/>
               </w:rPr>
-              <w:t xml:space="preserve"> Evet. "Ağırlıklı en küçük kareler" istendiğinde iki aracın vardığı kol bu, yani kullanıcıların aldıklarını en çok sandıkları kol. Discussion'da ikisinden daha az doğru olanı olduğunu belirtiyoruz.</w:t>
+              <w:t xml:space="preserve"> MD'de simüle ettiğimiz her koşulda evet. FA'da protokole bağlı: tek b = 0'lı b = 1000 edinimde negatif FA yanlılığı, bütün yöntemlerde ortak olan pozitif gürültü yanlılığını kısmen dengeliyor. Makalede bu açıkça yazıyor.</w:t>
             </w:r>
           </w:p>
         </w:tc>
@@ -5477,7 +4873,7 @@
                 <w:color w:val="1B4D3E"/>
                 <w:sz w:val="21"/>
               </w:rPr>
-              <w:t>Q: r = 1.0000 — isn't that just a sanity check?</w:t>
+              <w:t>Q: How do you know the real-data differences are noise, not artefacts?</w:t>
             </w:r>
             <w:r>
               <w:rPr>
@@ -5504,7 +4900,7 @@
                 <w:color w:val="1B4D3E"/>
                 <w:sz w:val="21"/>
               </w:rPr>
-              <w:t xml:space="preserve"> It is, and that is the point. The field's framing assumes implementation is the variable. Showing it is exactly zero removes that explanation and forces the question onto the estimator. </w:t>
+              <w:t xml:space="preserve"> We simulated noise on each voxel's own fitted tensor, at a noise level measured from the ten b = 0 volumes, and compared like with like. The outlier exclusions and the residual shuffle were also run on noise-only data as controls. What noise does not reproduce is 13–17% of the MD offsets and Stanford's most anisotropic bin. </w:t>
             </w:r>
             <w:r>
               <w:rPr>
@@ -5522,7 +4918,7 @@
                 <w:color w:val="1B4D3E"/>
                 <w:sz w:val="21"/>
               </w:rPr>
-              <w:t xml:space="preserve"> Öyle, ve mesele de bu. Alanın çerçevesi değişkenin uygulama olduğunu varsayıyor. Tam sıfır olduğunu göstermek o açıklamayı eliyor ve soruyu estimator'e mecbur bırakıyor.</w:t>
+              <w:t xml:space="preserve"> Her vokselin kendi tensörü üzerine, on b = 0 hacminden ölçülen gürültü seviyesinde gürültü ekleyip benzeri benzerle karşılaştırdık. Uç değer atma ve rezidüel karıştırma testleri salt gürültü verisinde de yapıldı. Gürültünün üretemediği kısım: MD farklarının %13–17'si ve Stanford'un en anizotropik bini.</w:t>
             </w:r>
           </w:p>
         </w:tc>
@@ -5562,7 +4958,7 @@
                 <w:color w:val="1B4D3E"/>
                 <w:sz w:val="21"/>
               </w:rPr>
-              <w:t>Q: Your phantom uses Gaussian noise; dMRI noise is Rician.</w:t>
+              <w:t>Q: Why report three rules for non-physical fits?</w:t>
             </w:r>
             <w:r>
               <w:rPr>
@@ -5589,7 +4985,7 @@
                 <w:color w:val="1B4D3E"/>
                 <w:sz w:val="21"/>
               </w:rPr>
-              <w:t xml:space="preserve"> Correct, and it is stated as a limitation. The phantom is a sanity check on accuracy, not a noise model. It reproduces the expected ordering across three SNR levels, which is what it was built to test. Rician noise would be the natural extension. </w:t>
+              <w:t xml:space="preserve"> Because the measured-signal fit returns FA above 1 in 5.3% of Sherbrooke voxels, and any rule that drops them selects on the quantity being measured. Reporting all three shows how much the answer depends on that choice: 89% to 106% for the Sherbrooke FA offset. </w:t>
             </w:r>
             <w:r>
               <w:rPr>
@@ -5607,7 +5003,7 @@
                 <w:color w:val="1B4D3E"/>
                 <w:sz w:val="21"/>
               </w:rPr>
-              <w:t xml:space="preserve"> Doğru, ve sınırlama olarak belirtildi. Fantom doğruluk için bir kontrol, bir gürültü modeli değil. Üç SNR seviyesinde beklenen sıralamayı üretiyor, ki test etmek için kurulmuştu. Rician gürültü doğal uzantı olur.</w:t>
+              <w:t xml:space="preserve"> Çünkü ölçülen-sinyal fit'i Sherbrooke vokselinin %5.3'ünde FA &gt; 1 döndürüyor ve bunları atan her kural, ölçülen büyüklüğe göre seçim yapmış olur. Üç kuralı birlikte vermek cevabın bu tercihe ne kadar bağlı olduğunu gösteriyor: Sherbrooke FA farkı için %89–106.</w:t>
             </w:r>
           </w:p>
         </w:tc>
@@ -5674,7 +5070,7 @@
                 <w:color w:val="1B4D3E"/>
                 <w:sz w:val="21"/>
               </w:rPr>
-              <w:t xml:space="preserve"> Stated in limitations. The central claim — that two implementations of one estimator agree — needed no sample, since the answer was exact equality. The claim it cannot support is how the between-scheme difference varies with acquisition, and we do not make it. </w:t>
+              <w:t xml:space="preserve"> Stated in the limitations. The central claim needs no sample, because the answer is exact equality. What two subjects cannot support is how the between-scheme difference varies with acquisition, and we do not claim it. </w:t>
             </w:r>
             <w:r>
               <w:rPr>
@@ -5692,7 +5088,7 @@
                 <w:color w:val="1B4D3E"/>
                 <w:sz w:val="21"/>
               </w:rPr>
-              <w:t xml:space="preserve"> Limitations'ta yazılı. Merkezi iddia — bir estimator'ün iki uygulamasının uyuştuğu — örneklem gerektirmiyor, çünkü cevap tam eşitlik. Destekleyemeyeceği iddia, şemalar arası farkın edinime göre nasıl değiştiği; onu da öne sürmüyoruz.</w:t>
+              <w:t xml:space="preserve"> Limitations'ta yazılı. Merkezi iddia örneklem gerektirmiyor, çünkü cevap tam eşitlik. İki deneğin destekleyemeyeceği iddia, şemalar arası farkın edinime göre nasıl değiştiği; onu da öne sürmüyoruz.</w:t>
             </w:r>
           </w:p>
         </w:tc>
@@ -5759,7 +5155,7 @@
                 <w:color w:val="1B4D3E"/>
                 <w:sz w:val="21"/>
               </w:rPr>
-              <w:t xml:space="preserve"> Predicted-signal weighting, which MRtrix3 and DIPY apply by default. In FSL that means being aware that </w:t>
+              <w:t xml:space="preserve"> Predicted-signal weighting, which MRtrix3 and DIPY apply by default. In FSL that means knowing that </w:t>
             </w:r>
             <w:r>
               <w:rPr>
@@ -6016,7 +5412,7 @@
                 <w:color w:val="333333"/>
                 <w:sz w:val="20"/>
               </w:rPr>
-              <w:t>FSL and MRtrix3 agree at r = 1.0000 when the estimator is matched; MAE 0.0000.</w:t>
+              <w:t>FSL and MRtrix3 agree at r = 1.0000 when the estimator is matched.</w:t>
             </w:r>
           </w:p>
         </w:tc>
@@ -6043,7 +5439,7 @@
                 <w:color w:val="333333"/>
                 <w:sz w:val="20"/>
               </w:rPr>
-              <w:t>Most quotable result</w:t>
+              <w:t>Strongest design element</w:t>
             </w:r>
           </w:p>
         </w:tc>
@@ -6068,7 +5464,7 @@
                 <w:color w:val="333333"/>
                 <w:sz w:val="20"/>
               </w:rPr>
-              <w:t>One flag inside FSL changes FA more than replacing FSL with another toolkit.</w:t>
+              <w:t>DIPY run twice on the same data with the weights swapped: 98% of the difference closes.</w:t>
             </w:r>
           </w:p>
         </w:tc>
@@ -6095,7 +5491,7 @@
                 <w:color w:val="333333"/>
                 <w:sz w:val="20"/>
               </w:rPr>
-              <w:t>Why two datasets?</w:t>
+              <w:t>Most useful for a reader</w:t>
             </w:r>
           </w:p>
         </w:tc>
@@ -6120,7 +5516,7 @@
                 <w:color w:val="333333"/>
                 <w:sz w:val="20"/>
               </w:rPr>
-              <w:t>Replication — and the noisier one showed twice the effect, which the SNR sweep then explained.</w:t>
+              <w:t>One flag inside FSL changes FA more than replacing FSL with another toolkit.</w:t>
             </w:r>
           </w:p>
         </w:tc>
@@ -6147,7 +5543,7 @@
                 <w:color w:val="333333"/>
                 <w:sz w:val="20"/>
               </w:rPr>
-              <w:t>Why three SNR levels?</w:t>
+              <w:t>Where the real-data differences come from</w:t>
             </w:r>
           </w:p>
         </w:tc>
@@ -6172,7 +5568,7 @@
                 <w:color w:val="333333"/>
                 <w:sz w:val="20"/>
               </w:rPr>
-              <w:t>The theoretical flaw is noise-dependent, so one SNR cannot test it. SNR 30 hid it.</w:t>
+              <w:t>Mostly noise acting through the estimator: 89–106% of the FA offsets at the measured noise level.</w:t>
             </w:r>
           </w:p>
         </w:tc>
@@ -6199,7 +5595,7 @@
                 <w:color w:val="333333"/>
                 <w:sz w:val="20"/>
               </w:rPr>
-              <w:t>Prior work</w:t>
+              <w:t>What is honestly unexplained</w:t>
             </w:r>
           </w:p>
         </w:tc>
@@ -6224,7 +5620,7 @@
                 <w:color w:val="333333"/>
                 <w:sz w:val="20"/>
               </w:rPr>
-              <w:t>Veraart et al. (2013) settled which scheme is better. We show the toolkits have not followed.</w:t>
+              <w:t>13–17% of the MD offsets, and Stanford's most anisotropic bin.</w:t>
             </w:r>
           </w:p>
         </w:tc>
@@ -6251,7 +5647,7 @@
                 <w:color w:val="333333"/>
                 <w:sz w:val="20"/>
               </w:rPr>
-              <w:t>Novelty, honestly</w:t>
+              <w:t>Prior work</w:t>
             </w:r>
           </w:p>
         </w:tc>
@@ -6276,7 +5672,7 @@
                 <w:color w:val="333333"/>
                 <w:sz w:val="20"/>
               </w:rPr>
-              <w:t>Not a discovery; a measured translation gap, with magnitudes nobody had reported.</w:t>
+              <w:t>Veraart et al. (2013) settled which scheme is better; Koay et al. (2006) gave the framework.</w:t>
             </w:r>
           </w:p>
         </w:tc>
@@ -6303,7 +5699,7 @@
                 <w:color w:val="333333"/>
                 <w:sz w:val="20"/>
               </w:rPr>
-              <w:t>Biggest limitation</w:t>
+              <w:t>Novelty, honestly</w:t>
             </w:r>
           </w:p>
         </w:tc>
@@ -6328,7 +5724,111 @@
                 <w:color w:val="333333"/>
                 <w:sz w:val="20"/>
               </w:rPr>
-              <w:t>One subject per dataset; Gaussian not Rician phantom noise; tensor model only.</w:t>
+              <w:t>Not a discovery; a measured translation gap, with magnitudes nobody had reported.</w:t>
+            </w:r>
+          </w:p>
+        </w:tc>
+      </w:tr>
+      <w:tr>
+        <w:tc>
+          <w:tcPr>
+            <w:tcW w:type="dxa" w:w="4929"/>
+          </w:tcPr>
+          <w:p>
+            <w:pPr>
+              <w:spacing w:line="240" w:lineRule="auto" w:before="20" w:after="20"/>
+            </w:pPr>
+            <w:r>
+              <w:rPr>
+                <w:rFonts w:ascii="Times New Roman" w:hAnsi="Times New Roman"/>
+                <w:sz w:val="20"/>
+              </w:rPr>
+            </w:r>
+            <w:r>
+              <w:rPr>
+                <w:rFonts w:ascii="Times New Roman" w:hAnsi="Times New Roman"/>
+                <w:b w:val="0"/>
+                <w:color w:val="333333"/>
+                <w:sz w:val="20"/>
+              </w:rPr>
+              <w:t>Biggest limitation</w:t>
+            </w:r>
+          </w:p>
+        </w:tc>
+        <w:tc>
+          <w:tcPr>
+            <w:tcW w:type="dxa" w:w="4929"/>
+          </w:tcPr>
+          <w:p>
+            <w:pPr>
+              <w:spacing w:line="240" w:lineRule="auto" w:before="20" w:after="20"/>
+            </w:pPr>
+            <w:r>
+              <w:rPr>
+                <w:rFonts w:ascii="Times New Roman" w:hAnsi="Times New Roman"/>
+                <w:sz w:val="20"/>
+              </w:rPr>
+            </w:r>
+            <w:r>
+              <w:rPr>
+                <w:rFonts w:ascii="Times New Roman" w:hAnsi="Times New Roman"/>
+                <w:b w:val="0"/>
+                <w:color w:val="333333"/>
+                <w:sz w:val="20"/>
+              </w:rPr>
+              <w:t>One subject per dataset; Rician phantoms without artefacts; the tensor model only.</w:t>
+            </w:r>
+          </w:p>
+        </w:tc>
+      </w:tr>
+      <w:tr>
+        <w:tc>
+          <w:tcPr>
+            <w:tcW w:type="dxa" w:w="4929"/>
+          </w:tcPr>
+          <w:p>
+            <w:pPr>
+              <w:spacing w:line="240" w:lineRule="auto" w:before="20" w:after="20"/>
+            </w:pPr>
+            <w:r>
+              <w:rPr>
+                <w:rFonts w:ascii="Times New Roman" w:hAnsi="Times New Roman"/>
+                <w:sz w:val="20"/>
+              </w:rPr>
+            </w:r>
+            <w:r>
+              <w:rPr>
+                <w:rFonts w:ascii="Times New Roman" w:hAnsi="Times New Roman"/>
+                <w:b w:val="0"/>
+                <w:color w:val="333333"/>
+                <w:sz w:val="20"/>
+              </w:rPr>
+              <w:t>If it all collapses to one line</w:t>
+            </w:r>
+          </w:p>
+        </w:tc>
+        <w:tc>
+          <w:tcPr>
+            <w:tcW w:type="dxa" w:w="4929"/>
+          </w:tcPr>
+          <w:p>
+            <w:pPr>
+              <w:spacing w:line="240" w:lineRule="auto" w:before="20" w:after="20"/>
+            </w:pPr>
+            <w:r>
+              <w:rPr>
+                <w:rFonts w:ascii="Times New Roman" w:hAnsi="Times New Roman"/>
+                <w:sz w:val="20"/>
+              </w:rPr>
+            </w:r>
+            <w:r>
+              <w:rPr>
+                <w:rFonts w:ascii="Times New Roman" w:hAnsi="Times New Roman"/>
+                <w:b w:val="0"/>
+                <w:color w:val="333333"/>
+                <w:sz w:val="20"/>
+              </w:rPr>
+              <w:t>"Weighted least squares" is a family, not an algorithm — and the members are not equally good.</w:t>
             </w:r>
           </w:p>
         </w:tc>

</xml_diff>